<commit_message>
Sessão 3 e 4 do módulo Flask
</commit_message>
<xml_diff>
--- a/Web/Flask/flask_course_plan.docx
+++ b/Web/Flask/flask_course_plan.docx
@@ -1537,7 +1537,7 @@
         <w:pStyle w:val="ListParagraph"/>
         <w:numPr>
           <w:ilvl w:val="0"/>
-          <w:numId w:val="2"/>
+          <w:numId w:val="3"/>
         </w:numPr>
         <w:spacing w:after="40" w:before="40"/>
       </w:pPr>
@@ -1556,7 +1556,7 @@
         <w:pStyle w:val="ListParagraph"/>
         <w:numPr>
           <w:ilvl w:val="0"/>
-          <w:numId w:val="2"/>
+          <w:numId w:val="3"/>
         </w:numPr>
         <w:spacing w:after="40" w:before="40"/>
       </w:pPr>
@@ -1575,7 +1575,7 @@
         <w:pStyle w:val="ListParagraph"/>
         <w:numPr>
           <w:ilvl w:val="0"/>
-          <w:numId w:val="2"/>
+          <w:numId w:val="3"/>
         </w:numPr>
         <w:spacing w:after="40" w:before="40"/>
       </w:pPr>
@@ -1594,7 +1594,7 @@
         <w:pStyle w:val="ListParagraph"/>
         <w:numPr>
           <w:ilvl w:val="0"/>
-          <w:numId w:val="2"/>
+          <w:numId w:val="3"/>
         </w:numPr>
         <w:spacing w:after="40" w:before="40"/>
       </w:pPr>
@@ -2546,7 +2546,7 @@
         <w:pStyle w:val="ListParagraph"/>
         <w:numPr>
           <w:ilvl w:val="0"/>
-          <w:numId w:val="3"/>
+          <w:numId w:val="4"/>
         </w:numPr>
         <w:spacing w:after="40" w:before="40"/>
       </w:pPr>
@@ -2565,7 +2565,7 @@
         <w:pStyle w:val="ListParagraph"/>
         <w:numPr>
           <w:ilvl w:val="0"/>
-          <w:numId w:val="3"/>
+          <w:numId w:val="4"/>
         </w:numPr>
         <w:spacing w:after="40" w:before="40"/>
       </w:pPr>
@@ -2584,7 +2584,7 @@
         <w:pStyle w:val="ListParagraph"/>
         <w:numPr>
           <w:ilvl w:val="0"/>
-          <w:numId w:val="3"/>
+          <w:numId w:val="4"/>
         </w:numPr>
         <w:spacing w:after="40" w:before="40"/>
       </w:pPr>
@@ -2603,7 +2603,7 @@
         <w:pStyle w:val="ListParagraph"/>
         <w:numPr>
           <w:ilvl w:val="0"/>
-          <w:numId w:val="3"/>
+          <w:numId w:val="4"/>
         </w:numPr>
         <w:spacing w:after="40" w:before="40"/>
       </w:pPr>
@@ -2731,7 +2731,7 @@
         <w:pStyle w:val="ListParagraph"/>
         <w:numPr>
           <w:ilvl w:val="0"/>
-          <w:numId w:val="4"/>
+          <w:numId w:val="5"/>
         </w:numPr>
         <w:spacing w:after="40" w:before="40"/>
       </w:pPr>
@@ -2750,7 +2750,7 @@
         <w:pStyle w:val="ListParagraph"/>
         <w:numPr>
           <w:ilvl w:val="0"/>
-          <w:numId w:val="4"/>
+          <w:numId w:val="5"/>
         </w:numPr>
         <w:spacing w:after="40" w:before="40"/>
       </w:pPr>
@@ -2769,7 +2769,7 @@
         <w:pStyle w:val="ListParagraph"/>
         <w:numPr>
           <w:ilvl w:val="0"/>
-          <w:numId w:val="4"/>
+          <w:numId w:val="5"/>
         </w:numPr>
         <w:spacing w:after="40" w:before="40"/>
       </w:pPr>
@@ -2825,7 +2825,7 @@
         <w:pStyle w:val="ListParagraph"/>
         <w:numPr>
           <w:ilvl w:val="0"/>
-          <w:numId w:val="5"/>
+          <w:numId w:val="6"/>
         </w:numPr>
         <w:spacing w:after="40" w:before="40"/>
       </w:pPr>
@@ -2844,7 +2844,7 @@
         <w:pStyle w:val="ListParagraph"/>
         <w:numPr>
           <w:ilvl w:val="0"/>
-          <w:numId w:val="5"/>
+          <w:numId w:val="6"/>
         </w:numPr>
         <w:spacing w:after="40" w:before="40"/>
       </w:pPr>
@@ -2863,7 +2863,7 @@
         <w:pStyle w:val="ListParagraph"/>
         <w:numPr>
           <w:ilvl w:val="0"/>
-          <w:numId w:val="5"/>
+          <w:numId w:val="6"/>
         </w:numPr>
         <w:spacing w:after="40" w:before="40"/>
       </w:pPr>
@@ -3033,7 +3033,7 @@
     </w:p>
     <w:p>
       <w:pPr>
-        <w:spacing w:after="80" w:before="80"/>
+        <w:spacing w:after="80" w:before="120"/>
       </w:pPr>
       <w:r>
         <w:rPr>
@@ -3087,7 +3087,7 @@
         <w:pStyle w:val="ListParagraph"/>
         <w:numPr>
           <w:ilvl w:val="0"/>
-          <w:numId w:val="6"/>
+          <w:numId w:val="7"/>
         </w:numPr>
         <w:spacing w:after="40" w:before="40"/>
       </w:pPr>
@@ -3106,7 +3106,7 @@
         <w:pStyle w:val="ListParagraph"/>
         <w:numPr>
           <w:ilvl w:val="0"/>
-          <w:numId w:val="6"/>
+          <w:numId w:val="7"/>
         </w:numPr>
         <w:spacing w:after="40" w:before="40"/>
       </w:pPr>
@@ -3125,7 +3125,7 @@
         <w:pStyle w:val="ListParagraph"/>
         <w:numPr>
           <w:ilvl w:val="0"/>
-          <w:numId w:val="6"/>
+          <w:numId w:val="7"/>
         </w:numPr>
         <w:spacing w:after="40" w:before="40"/>
       </w:pPr>
@@ -3144,7 +3144,7 @@
         <w:pStyle w:val="ListParagraph"/>
         <w:numPr>
           <w:ilvl w:val="0"/>
-          <w:numId w:val="6"/>
+          <w:numId w:val="7"/>
         </w:numPr>
         <w:spacing w:after="40" w:before="40"/>
       </w:pPr>
@@ -3268,7 +3268,7 @@
     </w:p>
     <w:p>
       <w:pPr>
-        <w:spacing w:after="80" w:before="80"/>
+        <w:spacing w:after="80" w:before="120"/>
       </w:pPr>
       <w:r>
         <w:rPr>
@@ -3322,7 +3322,7 @@
         <w:pStyle w:val="ListParagraph"/>
         <w:numPr>
           <w:ilvl w:val="0"/>
-          <w:numId w:val="7"/>
+          <w:numId w:val="8"/>
         </w:numPr>
         <w:spacing w:after="40" w:before="40"/>
       </w:pPr>
@@ -3341,7 +3341,7 @@
         <w:pStyle w:val="ListParagraph"/>
         <w:numPr>
           <w:ilvl w:val="0"/>
-          <w:numId w:val="7"/>
+          <w:numId w:val="8"/>
         </w:numPr>
         <w:spacing w:after="40" w:before="40"/>
       </w:pPr>
@@ -3360,7 +3360,7 @@
         <w:pStyle w:val="ListParagraph"/>
         <w:numPr>
           <w:ilvl w:val="0"/>
-          <w:numId w:val="7"/>
+          <w:numId w:val="8"/>
         </w:numPr>
         <w:spacing w:after="40" w:before="40"/>
       </w:pPr>
@@ -3379,7 +3379,7 @@
         <w:pStyle w:val="ListParagraph"/>
         <w:numPr>
           <w:ilvl w:val="0"/>
-          <w:numId w:val="7"/>
+          <w:numId w:val="8"/>
         </w:numPr>
         <w:spacing w:after="40" w:before="40"/>
       </w:pPr>
@@ -3419,7 +3419,7 @@
         <w:pStyle w:val="ListParagraph"/>
         <w:numPr>
           <w:ilvl w:val="0"/>
-          <w:numId w:val="8"/>
+          <w:numId w:val="9"/>
         </w:numPr>
         <w:spacing w:after="40" w:before="40"/>
       </w:pPr>
@@ -3438,7 +3438,7 @@
         <w:pStyle w:val="ListParagraph"/>
         <w:numPr>
           <w:ilvl w:val="0"/>
-          <w:numId w:val="8"/>
+          <w:numId w:val="9"/>
         </w:numPr>
         <w:spacing w:after="40" w:before="40"/>
       </w:pPr>
@@ -3457,7 +3457,7 @@
         <w:pStyle w:val="ListParagraph"/>
         <w:numPr>
           <w:ilvl w:val="0"/>
-          <w:numId w:val="8"/>
+          <w:numId w:val="9"/>
         </w:numPr>
         <w:spacing w:after="40" w:before="40"/>
       </w:pPr>
@@ -3579,7 +3579,7 @@
         <w:pStyle w:val="ListParagraph"/>
         <w:numPr>
           <w:ilvl w:val="0"/>
-          <w:numId w:val="9"/>
+          <w:numId w:val="10"/>
         </w:numPr>
         <w:spacing w:after="40" w:before="40"/>
       </w:pPr>
@@ -3598,7 +3598,7 @@
         <w:pStyle w:val="ListParagraph"/>
         <w:numPr>
           <w:ilvl w:val="0"/>
-          <w:numId w:val="9"/>
+          <w:numId w:val="10"/>
         </w:numPr>
         <w:spacing w:after="40" w:before="40"/>
       </w:pPr>
@@ -3617,7 +3617,7 @@
         <w:pStyle w:val="ListParagraph"/>
         <w:numPr>
           <w:ilvl w:val="0"/>
-          <w:numId w:val="9"/>
+          <w:numId w:val="10"/>
         </w:numPr>
         <w:spacing w:after="40" w:before="40"/>
       </w:pPr>
@@ -3657,7 +3657,7 @@
         <w:pStyle w:val="ListParagraph"/>
         <w:numPr>
           <w:ilvl w:val="0"/>
-          <w:numId w:val="10"/>
+          <w:numId w:val="11"/>
         </w:numPr>
         <w:spacing w:after="40" w:before="40"/>
       </w:pPr>
@@ -3687,7 +3687,7 @@
         <w:pStyle w:val="ListParagraph"/>
         <w:numPr>
           <w:ilvl w:val="0"/>
-          <w:numId w:val="10"/>
+          <w:numId w:val="11"/>
         </w:numPr>
         <w:spacing w:after="40" w:before="40"/>
       </w:pPr>
@@ -3717,7 +3717,7 @@
         <w:pStyle w:val="ListParagraph"/>
         <w:numPr>
           <w:ilvl w:val="0"/>
-          <w:numId w:val="10"/>
+          <w:numId w:val="11"/>
         </w:numPr>
         <w:spacing w:after="40" w:before="40"/>
       </w:pPr>
@@ -4587,7 +4587,7 @@
         <w:pStyle w:val="ListParagraph"/>
         <w:numPr>
           <w:ilvl w:val="0"/>
-          <w:numId w:val="11"/>
+          <w:numId w:val="12"/>
         </w:numPr>
         <w:spacing w:after="40" w:before="40"/>
       </w:pPr>
@@ -4606,7 +4606,7 @@
         <w:pStyle w:val="ListParagraph"/>
         <w:numPr>
           <w:ilvl w:val="0"/>
-          <w:numId w:val="11"/>
+          <w:numId w:val="12"/>
         </w:numPr>
         <w:spacing w:after="40" w:before="40"/>
       </w:pPr>
@@ -4625,7 +4625,7 @@
         <w:pStyle w:val="ListParagraph"/>
         <w:numPr>
           <w:ilvl w:val="0"/>
-          <w:numId w:val="11"/>
+          <w:numId w:val="12"/>
         </w:numPr>
         <w:spacing w:after="40" w:before="40"/>
       </w:pPr>
@@ -4644,7 +4644,7 @@
         <w:pStyle w:val="ListParagraph"/>
         <w:numPr>
           <w:ilvl w:val="0"/>
-          <w:numId w:val="11"/>
+          <w:numId w:val="12"/>
         </w:numPr>
         <w:spacing w:after="40" w:before="40"/>
       </w:pPr>
@@ -4663,7 +4663,7 @@
         <w:pStyle w:val="ListParagraph"/>
         <w:numPr>
           <w:ilvl w:val="0"/>
-          <w:numId w:val="11"/>
+          <w:numId w:val="12"/>
         </w:numPr>
         <w:spacing w:after="40" w:before="40"/>
       </w:pPr>
@@ -4777,7 +4777,7 @@
         <w:pStyle w:val="ListParagraph"/>
         <w:numPr>
           <w:ilvl w:val="0"/>
-          <w:numId w:val="12"/>
+          <w:numId w:val="13"/>
         </w:numPr>
         <w:spacing w:after="40" w:before="40"/>
       </w:pPr>
@@ -4796,7 +4796,7 @@
         <w:pStyle w:val="ListParagraph"/>
         <w:numPr>
           <w:ilvl w:val="0"/>
-          <w:numId w:val="12"/>
+          <w:numId w:val="13"/>
         </w:numPr>
         <w:spacing w:after="40" w:before="40"/>
       </w:pPr>
@@ -4815,7 +4815,7 @@
         <w:pStyle w:val="ListParagraph"/>
         <w:numPr>
           <w:ilvl w:val="0"/>
-          <w:numId w:val="12"/>
+          <w:numId w:val="13"/>
         </w:numPr>
         <w:spacing w:after="40" w:before="40"/>
       </w:pPr>
@@ -4834,7 +4834,7 @@
         <w:pStyle w:val="ListParagraph"/>
         <w:numPr>
           <w:ilvl w:val="0"/>
-          <w:numId w:val="12"/>
+          <w:numId w:val="13"/>
         </w:numPr>
         <w:spacing w:after="40" w:before="40"/>
       </w:pPr>
@@ -4853,7 +4853,7 @@
         <w:pStyle w:val="ListParagraph"/>
         <w:numPr>
           <w:ilvl w:val="0"/>
-          <w:numId w:val="12"/>
+          <w:numId w:val="13"/>
         </w:numPr>
         <w:spacing w:after="40" w:before="40"/>
       </w:pPr>
@@ -4968,7 +4968,7 @@
         <w:pStyle w:val="ListParagraph"/>
         <w:numPr>
           <w:ilvl w:val="0"/>
-          <w:numId w:val="13"/>
+          <w:numId w:val="14"/>
         </w:numPr>
         <w:spacing w:after="40" w:before="40"/>
       </w:pPr>
@@ -4987,7 +4987,7 @@
         <w:pStyle w:val="ListParagraph"/>
         <w:numPr>
           <w:ilvl w:val="0"/>
-          <w:numId w:val="13"/>
+          <w:numId w:val="14"/>
         </w:numPr>
         <w:spacing w:after="40" w:before="40"/>
       </w:pPr>
@@ -5006,7 +5006,7 @@
         <w:pStyle w:val="ListParagraph"/>
         <w:numPr>
           <w:ilvl w:val="0"/>
-          <w:numId w:val="13"/>
+          <w:numId w:val="14"/>
         </w:numPr>
         <w:spacing w:after="40" w:before="40"/>
       </w:pPr>
@@ -5025,7 +5025,7 @@
         <w:pStyle w:val="ListParagraph"/>
         <w:numPr>
           <w:ilvl w:val="0"/>
-          <w:numId w:val="13"/>
+          <w:numId w:val="14"/>
         </w:numPr>
         <w:spacing w:after="40" w:before="40"/>
       </w:pPr>
@@ -5194,7 +5194,7 @@
     </w:p>
     <w:p>
       <w:pPr>
-        <w:spacing w:after="80" w:before="80"/>
+        <w:spacing w:after="80" w:before="120"/>
       </w:pPr>
       <w:r>
         <w:rPr>
@@ -5248,7 +5248,7 @@
         <w:pStyle w:val="ListParagraph"/>
         <w:numPr>
           <w:ilvl w:val="0"/>
-          <w:numId w:val="14"/>
+          <w:numId w:val="15"/>
         </w:numPr>
         <w:spacing w:after="40" w:before="40"/>
       </w:pPr>
@@ -5267,7 +5267,7 @@
         <w:pStyle w:val="ListParagraph"/>
         <w:numPr>
           <w:ilvl w:val="0"/>
-          <w:numId w:val="14"/>
+          <w:numId w:val="15"/>
         </w:numPr>
         <w:spacing w:after="40" w:before="40"/>
       </w:pPr>
@@ -5286,7 +5286,7 @@
         <w:pStyle w:val="ListParagraph"/>
         <w:numPr>
           <w:ilvl w:val="0"/>
-          <w:numId w:val="14"/>
+          <w:numId w:val="15"/>
         </w:numPr>
         <w:spacing w:after="40" w:before="40"/>
       </w:pPr>
@@ -5305,7 +5305,7 @@
         <w:pStyle w:val="ListParagraph"/>
         <w:numPr>
           <w:ilvl w:val="0"/>
-          <w:numId w:val="14"/>
+          <w:numId w:val="15"/>
         </w:numPr>
         <w:spacing w:after="40" w:before="40"/>
       </w:pPr>
@@ -5324,7 +5324,7 @@
         <w:pStyle w:val="ListParagraph"/>
         <w:numPr>
           <w:ilvl w:val="0"/>
-          <w:numId w:val="14"/>
+          <w:numId w:val="15"/>
         </w:numPr>
         <w:spacing w:after="40" w:before="40"/>
       </w:pPr>
@@ -5343,7 +5343,7 @@
         <w:pStyle w:val="ListParagraph"/>
         <w:numPr>
           <w:ilvl w:val="0"/>
-          <w:numId w:val="14"/>
+          <w:numId w:val="15"/>
         </w:numPr>
         <w:spacing w:after="40" w:before="40"/>
       </w:pPr>
@@ -5467,7 +5467,7 @@
     </w:p>
     <w:p>
       <w:pPr>
-        <w:spacing w:after="80" w:before="80"/>
+        <w:spacing w:after="80" w:before="120"/>
       </w:pPr>
       <w:r>
         <w:rPr>
@@ -5521,7 +5521,7 @@
         <w:pStyle w:val="ListParagraph"/>
         <w:numPr>
           <w:ilvl w:val="0"/>
-          <w:numId w:val="15"/>
+          <w:numId w:val="16"/>
         </w:numPr>
         <w:spacing w:after="40" w:before="40"/>
       </w:pPr>
@@ -5540,7 +5540,7 @@
         <w:pStyle w:val="ListParagraph"/>
         <w:numPr>
           <w:ilvl w:val="0"/>
-          <w:numId w:val="15"/>
+          <w:numId w:val="16"/>
         </w:numPr>
         <w:spacing w:after="40" w:before="40"/>
       </w:pPr>
@@ -5559,7 +5559,7 @@
         <w:pStyle w:val="ListParagraph"/>
         <w:numPr>
           <w:ilvl w:val="0"/>
-          <w:numId w:val="15"/>
+          <w:numId w:val="16"/>
         </w:numPr>
         <w:spacing w:after="40" w:before="40"/>
       </w:pPr>
@@ -5578,7 +5578,7 @@
         <w:pStyle w:val="ListParagraph"/>
         <w:numPr>
           <w:ilvl w:val="0"/>
-          <w:numId w:val="15"/>
+          <w:numId w:val="16"/>
         </w:numPr>
         <w:spacing w:after="40" w:before="40"/>
       </w:pPr>
@@ -5597,7 +5597,7 @@
         <w:pStyle w:val="ListParagraph"/>
         <w:numPr>
           <w:ilvl w:val="0"/>
-          <w:numId w:val="15"/>
+          <w:numId w:val="16"/>
         </w:numPr>
         <w:spacing w:after="40" w:before="40"/>
       </w:pPr>
@@ -5637,7 +5637,7 @@
         <w:pStyle w:val="ListParagraph"/>
         <w:numPr>
           <w:ilvl w:val="0"/>
-          <w:numId w:val="16"/>
+          <w:numId w:val="17"/>
         </w:numPr>
         <w:spacing w:after="40" w:before="40"/>
       </w:pPr>
@@ -5656,7 +5656,7 @@
         <w:pStyle w:val="ListParagraph"/>
         <w:numPr>
           <w:ilvl w:val="0"/>
-          <w:numId w:val="16"/>
+          <w:numId w:val="17"/>
         </w:numPr>
         <w:spacing w:after="40" w:before="40"/>
       </w:pPr>
@@ -5675,7 +5675,7 @@
         <w:pStyle w:val="ListParagraph"/>
         <w:numPr>
           <w:ilvl w:val="0"/>
-          <w:numId w:val="16"/>
+          <w:numId w:val="17"/>
         </w:numPr>
         <w:spacing w:after="40" w:before="40"/>
       </w:pPr>
@@ -5694,7 +5694,7 @@
         <w:pStyle w:val="ListParagraph"/>
         <w:numPr>
           <w:ilvl w:val="0"/>
-          <w:numId w:val="16"/>
+          <w:numId w:val="17"/>
         </w:numPr>
         <w:spacing w:after="40" w:before="40"/>
       </w:pPr>
@@ -5816,7 +5816,7 @@
         <w:pStyle w:val="ListParagraph"/>
         <w:numPr>
           <w:ilvl w:val="0"/>
-          <w:numId w:val="17"/>
+          <w:numId w:val="18"/>
         </w:numPr>
         <w:spacing w:after="40" w:before="40"/>
       </w:pPr>
@@ -5835,7 +5835,7 @@
         <w:pStyle w:val="ListParagraph"/>
         <w:numPr>
           <w:ilvl w:val="0"/>
-          <w:numId w:val="17"/>
+          <w:numId w:val="18"/>
         </w:numPr>
         <w:spacing w:after="40" w:before="40"/>
       </w:pPr>
@@ -5854,7 +5854,7 @@
         <w:pStyle w:val="ListParagraph"/>
         <w:numPr>
           <w:ilvl w:val="0"/>
-          <w:numId w:val="17"/>
+          <w:numId w:val="18"/>
         </w:numPr>
         <w:spacing w:after="40" w:before="40"/>
       </w:pPr>
@@ -5894,7 +5894,7 @@
         <w:pStyle w:val="ListParagraph"/>
         <w:numPr>
           <w:ilvl w:val="0"/>
-          <w:numId w:val="18"/>
+          <w:numId w:val="19"/>
         </w:numPr>
         <w:spacing w:after="40" w:before="40"/>
       </w:pPr>
@@ -5924,7 +5924,7 @@
         <w:pStyle w:val="ListParagraph"/>
         <w:numPr>
           <w:ilvl w:val="0"/>
-          <w:numId w:val="18"/>
+          <w:numId w:val="19"/>
         </w:numPr>
         <w:spacing w:after="40" w:before="40"/>
       </w:pPr>
@@ -5954,7 +5954,7 @@
         <w:pStyle w:val="ListParagraph"/>
         <w:numPr>
           <w:ilvl w:val="0"/>
-          <w:numId w:val="18"/>
+          <w:numId w:val="19"/>
         </w:numPr>
         <w:spacing w:after="40" w:before="40"/>
       </w:pPr>
@@ -5976,15 +5976,15 @@
           <w:sz w:val="21"/>
           <w:szCs w:val="21"/>
         </w:rPr>
-        <w:t xml:space="preserve">Show {{%}} vs {%%}  vs {{}} side by side — teenagers mix these up constantly</w:t>
-      </w:r>
-    </w:p>
-    <w:p>
-      <w:pPr>
-        <w:pStyle w:val="ListParagraph"/>
-        <w:numPr>
-          <w:ilvl w:val="0"/>
-          <w:numId w:val="18"/>
+        <w:t xml:space="preserve">Show {{%}} vs {%%} vs {{}} side by side — teenagers mix these up constantly</w:t>
+      </w:r>
+    </w:p>
+    <w:p>
+      <w:pPr>
+        <w:pStyle w:val="ListParagraph"/>
+        <w:numPr>
+          <w:ilvl w:val="0"/>
+          <w:numId w:val="19"/>
         </w:numPr>
         <w:spacing w:after="40" w:before="40"/>
       </w:pPr>
@@ -6927,7 +6927,7 @@
         <w:pStyle w:val="ListParagraph"/>
         <w:numPr>
           <w:ilvl w:val="0"/>
-          <w:numId w:val="19"/>
+          <w:numId w:val="20"/>
         </w:numPr>
         <w:spacing w:after="40" w:before="40"/>
       </w:pPr>
@@ -6946,7 +6946,7 @@
         <w:pStyle w:val="ListParagraph"/>
         <w:numPr>
           <w:ilvl w:val="0"/>
-          <w:numId w:val="19"/>
+          <w:numId w:val="20"/>
         </w:numPr>
         <w:spacing w:after="40" w:before="40"/>
       </w:pPr>
@@ -6965,7 +6965,7 @@
         <w:pStyle w:val="ListParagraph"/>
         <w:numPr>
           <w:ilvl w:val="0"/>
-          <w:numId w:val="19"/>
+          <w:numId w:val="20"/>
         </w:numPr>
         <w:spacing w:after="40" w:before="40"/>
       </w:pPr>
@@ -6984,7 +6984,7 @@
         <w:pStyle w:val="ListParagraph"/>
         <w:numPr>
           <w:ilvl w:val="0"/>
-          <w:numId w:val="19"/>
+          <w:numId w:val="20"/>
         </w:numPr>
         <w:spacing w:after="40" w:before="40"/>
       </w:pPr>
@@ -7003,7 +7003,7 @@
         <w:pStyle w:val="ListParagraph"/>
         <w:numPr>
           <w:ilvl w:val="0"/>
-          <w:numId w:val="19"/>
+          <w:numId w:val="20"/>
         </w:numPr>
         <w:spacing w:after="40" w:before="40"/>
       </w:pPr>
@@ -7022,7 +7022,7 @@
         <w:pStyle w:val="ListParagraph"/>
         <w:numPr>
           <w:ilvl w:val="0"/>
-          <w:numId w:val="19"/>
+          <w:numId w:val="20"/>
         </w:numPr>
         <w:spacing w:after="40" w:before="40"/>
       </w:pPr>
@@ -7041,7 +7041,7 @@
         <w:pStyle w:val="ListParagraph"/>
         <w:numPr>
           <w:ilvl w:val="0"/>
-          <w:numId w:val="19"/>
+          <w:numId w:val="20"/>
         </w:numPr>
         <w:spacing w:after="40" w:before="40"/>
       </w:pPr>
@@ -7214,7 +7214,7 @@
         <w:pStyle w:val="ListParagraph"/>
         <w:numPr>
           <w:ilvl w:val="0"/>
-          <w:numId w:val="20"/>
+          <w:numId w:val="21"/>
         </w:numPr>
         <w:spacing w:after="40" w:before="40"/>
       </w:pPr>
@@ -7233,7 +7233,7 @@
         <w:pStyle w:val="ListParagraph"/>
         <w:numPr>
           <w:ilvl w:val="0"/>
-          <w:numId w:val="20"/>
+          <w:numId w:val="21"/>
         </w:numPr>
         <w:spacing w:after="40" w:before="40"/>
       </w:pPr>
@@ -7252,7 +7252,7 @@
         <w:pStyle w:val="ListParagraph"/>
         <w:numPr>
           <w:ilvl w:val="0"/>
-          <w:numId w:val="20"/>
+          <w:numId w:val="21"/>
         </w:numPr>
         <w:spacing w:after="40" w:before="40"/>
       </w:pPr>
@@ -7271,7 +7271,7 @@
         <w:pStyle w:val="ListParagraph"/>
         <w:numPr>
           <w:ilvl w:val="0"/>
-          <w:numId w:val="20"/>
+          <w:numId w:val="21"/>
         </w:numPr>
         <w:spacing w:after="40" w:before="40"/>
       </w:pPr>
@@ -7290,7 +7290,7 @@
         <w:pStyle w:val="ListParagraph"/>
         <w:numPr>
           <w:ilvl w:val="0"/>
-          <w:numId w:val="20"/>
+          <w:numId w:val="21"/>
         </w:numPr>
         <w:spacing w:after="40" w:before="40"/>
       </w:pPr>
@@ -7309,7 +7309,7 @@
         <w:pStyle w:val="ListParagraph"/>
         <w:numPr>
           <w:ilvl w:val="0"/>
-          <w:numId w:val="20"/>
+          <w:numId w:val="21"/>
         </w:numPr>
         <w:spacing w:after="40" w:before="40"/>
       </w:pPr>
@@ -7379,7 +7379,7 @@
         <w:pStyle w:val="ListParagraph"/>
         <w:numPr>
           <w:ilvl w:val="0"/>
-          <w:numId w:val="21"/>
+          <w:numId w:val="22"/>
         </w:numPr>
         <w:spacing w:after="40" w:before="40"/>
       </w:pPr>
@@ -7398,7 +7398,7 @@
         <w:pStyle w:val="ListParagraph"/>
         <w:numPr>
           <w:ilvl w:val="0"/>
-          <w:numId w:val="21"/>
+          <w:numId w:val="22"/>
         </w:numPr>
         <w:spacing w:after="40" w:before="40"/>
       </w:pPr>
@@ -7417,7 +7417,7 @@
         <w:pStyle w:val="ListParagraph"/>
         <w:numPr>
           <w:ilvl w:val="0"/>
-          <w:numId w:val="21"/>
+          <w:numId w:val="22"/>
         </w:numPr>
         <w:spacing w:after="40" w:before="40"/>
       </w:pPr>
@@ -7528,7 +7528,7 @@
     </w:p>
     <w:p>
       <w:pPr>
-        <w:spacing w:after="80" w:before="80"/>
+        <w:spacing w:after="80" w:before="120"/>
       </w:pPr>
       <w:r>
         <w:rPr>
@@ -7582,7 +7582,7 @@
         <w:pStyle w:val="ListParagraph"/>
         <w:numPr>
           <w:ilvl w:val="0"/>
-          <w:numId w:val="22"/>
+          <w:numId w:val="23"/>
         </w:numPr>
         <w:spacing w:after="40" w:before="40"/>
       </w:pPr>
@@ -7601,7 +7601,7 @@
         <w:pStyle w:val="ListParagraph"/>
         <w:numPr>
           <w:ilvl w:val="0"/>
-          <w:numId w:val="22"/>
+          <w:numId w:val="23"/>
         </w:numPr>
         <w:spacing w:after="40" w:before="40"/>
       </w:pPr>
@@ -7620,7 +7620,7 @@
         <w:pStyle w:val="ListParagraph"/>
         <w:numPr>
           <w:ilvl w:val="0"/>
-          <w:numId w:val="22"/>
+          <w:numId w:val="23"/>
         </w:numPr>
         <w:spacing w:after="40" w:before="40"/>
       </w:pPr>
@@ -7639,7 +7639,7 @@
         <w:pStyle w:val="ListParagraph"/>
         <w:numPr>
           <w:ilvl w:val="0"/>
-          <w:numId w:val="22"/>
+          <w:numId w:val="23"/>
         </w:numPr>
         <w:spacing w:after="40" w:before="40"/>
       </w:pPr>
@@ -7658,7 +7658,7 @@
         <w:pStyle w:val="ListParagraph"/>
         <w:numPr>
           <w:ilvl w:val="0"/>
-          <w:numId w:val="22"/>
+          <w:numId w:val="23"/>
         </w:numPr>
         <w:spacing w:after="40" w:before="40"/>
       </w:pPr>
@@ -7677,7 +7677,7 @@
         <w:pStyle w:val="ListParagraph"/>
         <w:numPr>
           <w:ilvl w:val="0"/>
-          <w:numId w:val="22"/>
+          <w:numId w:val="23"/>
         </w:numPr>
         <w:spacing w:after="40" w:before="40"/>
       </w:pPr>
@@ -7820,7 +7820,7 @@
     </w:p>
     <w:p>
       <w:pPr>
-        <w:spacing w:after="80" w:before="80"/>
+        <w:spacing w:after="80" w:before="120"/>
       </w:pPr>
       <w:r>
         <w:rPr>
@@ -7874,7 +7874,7 @@
         <w:pStyle w:val="ListParagraph"/>
         <w:numPr>
           <w:ilvl w:val="0"/>
-          <w:numId w:val="23"/>
+          <w:numId w:val="24"/>
         </w:numPr>
         <w:spacing w:after="40" w:before="40"/>
       </w:pPr>
@@ -7893,7 +7893,7 @@
         <w:pStyle w:val="ListParagraph"/>
         <w:numPr>
           <w:ilvl w:val="0"/>
-          <w:numId w:val="23"/>
+          <w:numId w:val="24"/>
         </w:numPr>
         <w:spacing w:after="40" w:before="40"/>
       </w:pPr>
@@ -7912,7 +7912,7 @@
         <w:pStyle w:val="ListParagraph"/>
         <w:numPr>
           <w:ilvl w:val="0"/>
-          <w:numId w:val="23"/>
+          <w:numId w:val="24"/>
         </w:numPr>
         <w:spacing w:after="40" w:before="40"/>
       </w:pPr>
@@ -7931,7 +7931,7 @@
         <w:pStyle w:val="ListParagraph"/>
         <w:numPr>
           <w:ilvl w:val="0"/>
-          <w:numId w:val="23"/>
+          <w:numId w:val="24"/>
         </w:numPr>
         <w:spacing w:after="40" w:before="40"/>
       </w:pPr>
@@ -7950,7 +7950,7 @@
         <w:pStyle w:val="ListParagraph"/>
         <w:numPr>
           <w:ilvl w:val="0"/>
-          <w:numId w:val="23"/>
+          <w:numId w:val="24"/>
         </w:numPr>
         <w:spacing w:after="40" w:before="40"/>
       </w:pPr>
@@ -7969,7 +7969,7 @@
         <w:pStyle w:val="ListParagraph"/>
         <w:numPr>
           <w:ilvl w:val="0"/>
-          <w:numId w:val="23"/>
+          <w:numId w:val="24"/>
         </w:numPr>
         <w:spacing w:after="40" w:before="40"/>
       </w:pPr>
@@ -8009,7 +8009,7 @@
         <w:pStyle w:val="ListParagraph"/>
         <w:numPr>
           <w:ilvl w:val="0"/>
-          <w:numId w:val="24"/>
+          <w:numId w:val="25"/>
         </w:numPr>
         <w:spacing w:after="40" w:before="40"/>
       </w:pPr>
@@ -8028,7 +8028,7 @@
         <w:pStyle w:val="ListParagraph"/>
         <w:numPr>
           <w:ilvl w:val="0"/>
-          <w:numId w:val="24"/>
+          <w:numId w:val="25"/>
         </w:numPr>
         <w:spacing w:after="40" w:before="40"/>
       </w:pPr>
@@ -8047,7 +8047,7 @@
         <w:pStyle w:val="ListParagraph"/>
         <w:numPr>
           <w:ilvl w:val="0"/>
-          <w:numId w:val="24"/>
+          <w:numId w:val="25"/>
         </w:numPr>
         <w:spacing w:after="40" w:before="40"/>
       </w:pPr>
@@ -8066,7 +8066,7 @@
         <w:pStyle w:val="ListParagraph"/>
         <w:numPr>
           <w:ilvl w:val="0"/>
-          <w:numId w:val="24"/>
+          <w:numId w:val="25"/>
         </w:numPr>
         <w:spacing w:after="40" w:before="40"/>
       </w:pPr>
@@ -8188,7 +8188,7 @@
         <w:pStyle w:val="ListParagraph"/>
         <w:numPr>
           <w:ilvl w:val="0"/>
-          <w:numId w:val="25"/>
+          <w:numId w:val="26"/>
         </w:numPr>
         <w:spacing w:after="40" w:before="40"/>
       </w:pPr>
@@ -8207,7 +8207,7 @@
         <w:pStyle w:val="ListParagraph"/>
         <w:numPr>
           <w:ilvl w:val="0"/>
-          <w:numId w:val="25"/>
+          <w:numId w:val="26"/>
         </w:numPr>
         <w:spacing w:after="40" w:before="40"/>
       </w:pPr>
@@ -8226,7 +8226,7 @@
         <w:pStyle w:val="ListParagraph"/>
         <w:numPr>
           <w:ilvl w:val="0"/>
-          <w:numId w:val="25"/>
+          <w:numId w:val="26"/>
         </w:numPr>
         <w:spacing w:after="40" w:before="40"/>
       </w:pPr>
@@ -8266,7 +8266,7 @@
         <w:pStyle w:val="ListParagraph"/>
         <w:numPr>
           <w:ilvl w:val="0"/>
-          <w:numId w:val="26"/>
+          <w:numId w:val="27"/>
         </w:numPr>
         <w:spacing w:after="40" w:before="40"/>
       </w:pPr>
@@ -8296,7 +8296,7 @@
         <w:pStyle w:val="ListParagraph"/>
         <w:numPr>
           <w:ilvl w:val="0"/>
-          <w:numId w:val="26"/>
+          <w:numId w:val="27"/>
         </w:numPr>
         <w:spacing w:after="40" w:before="40"/>
       </w:pPr>
@@ -8326,7 +8326,7 @@
         <w:pStyle w:val="ListParagraph"/>
         <w:numPr>
           <w:ilvl w:val="0"/>
-          <w:numId w:val="26"/>
+          <w:numId w:val="27"/>
         </w:numPr>
         <w:spacing w:after="40" w:before="40"/>
       </w:pPr>
@@ -8356,7 +8356,7 @@
         <w:pStyle w:val="ListParagraph"/>
         <w:numPr>
           <w:ilvl w:val="0"/>
-          <w:numId w:val="26"/>
+          <w:numId w:val="27"/>
         </w:numPr>
         <w:spacing w:after="40" w:before="40"/>
       </w:pPr>
@@ -8454,9 +8454,2373 @@
         <w:t xml:space="preserve">The hard-refresh tip (Ctrl+Shift+R) pays dividends for the rest of the course. Teach it deliberately, write it on the board, and bring it up again any time a student says "my changes aren't showing up."</w:t>
       </w:r>
     </w:p>
+    <w:p>
+      <w:pPr>
+        <w:sectPr>
+          <w:headerReference w:type="default" r:id="rId13"/>
+          <w:footerReference w:type="default" r:id="rId14"/>
+          <w:pgSz w:w="12240" w:h="15840" w:orient="portrait"/>
+          <w:pgMar w:top="1440" w:right="1440" w:bottom="1440" w:left="1440" w:header="708" w:footer="708" w:gutter="0"/>
+          <w:pgNumType/>
+          <w:docGrid w:linePitch="360"/>
+        </w:sectPr>
+      </w:pPr>
+    </w:p>
+    <w:tbl>
+      <w:tblPr>
+        <w:tblW w:type="dxa" w:w="9360"/>
+        <w:tblBorders>
+          <w:top w:val="single" w:color="auto" w:sz="4"/>
+          <w:left w:val="single" w:color="auto" w:sz="4"/>
+          <w:bottom w:val="single" w:color="auto" w:sz="4"/>
+          <w:right w:val="single" w:color="auto" w:sz="4"/>
+          <w:insideH w:val="single" w:color="auto" w:sz="4"/>
+          <w:insideV w:val="single" w:color="auto" w:sz="4"/>
+        </w:tblBorders>
+      </w:tblPr>
+      <w:tblGrid>
+        <w:gridCol w:w="9360"/>
+      </w:tblGrid>
+      <w:tr>
+        <w:tc>
+          <w:tcPr>
+            <w:tcW w:type="dxa" w:w="9360"/>
+            <w:tcBorders>
+              <w:top w:val="none" w:sz="0"/>
+              <w:left w:val="none" w:sz="0"/>
+              <w:bottom w:val="none" w:sz="0"/>
+              <w:right w:val="none" w:sz="0"/>
+            </w:tcBorders>
+            <w:shd w:fill="1B3A5C" w:val="clear"/>
+            <w:tcMar>
+              <w:top w:type="dxa" w:w="200"/>
+              <w:left w:type="dxa" w:w="300"/>
+              <w:bottom w:type="dxa" w:w="200"/>
+              <w:right w:type="dxa" w:w="300"/>
+            </w:tcMar>
+          </w:tcPr>
+          <w:p>
+            <w:pPr>
+              <w:spacing w:after="40"/>
+            </w:pPr>
+            <w:r>
+              <w:rPr>
+                <w:rFonts w:ascii="Arial" w:cs="Arial" w:eastAsia="Arial" w:hAnsi="Arial"/>
+                <w:b/>
+                <w:bCs/>
+                <w:caps/>
+                <w:color w:val="D5E8F0"/>
+                <w:sz w:val="20"/>
+                <w:szCs w:val="20"/>
+              </w:rPr>
+              <w:t xml:space="preserve">SESSION 4</w:t>
+            </w:r>
+          </w:p>
+          <w:p>
+            <w:pPr>
+              <w:spacing w:after="60"/>
+            </w:pPr>
+            <w:r>
+              <w:rPr>
+                <w:rFonts w:ascii="Arial" w:cs="Arial" w:eastAsia="Arial" w:hAnsi="Arial"/>
+                <w:b/>
+                <w:bCs/>
+                <w:color w:val="FFFFFF"/>
+                <w:sz w:val="36"/>
+                <w:szCs w:val="36"/>
+              </w:rPr>
+              <w:t xml:space="preserve">Forms &amp; User Input (GET)</w:t>
+            </w:r>
+          </w:p>
+          <w:p>
+            <w:r>
+              <w:rPr>
+                <w:rFonts w:ascii="Arial" w:cs="Arial" w:eastAsia="Arial" w:hAnsi="Arial"/>
+                <w:i/>
+                <w:iCs/>
+                <w:color w:val="D5E8F0"/>
+                <w:sz w:val="22"/>
+                <w:szCs w:val="22"/>
+              </w:rPr>
+              <w:t xml:space="preserve">The web stops being read-only — users can finally talk back</w:t>
+            </w:r>
+          </w:p>
+        </w:tc>
+      </w:tr>
+    </w:tbl>
+    <w:p>
+      <w:pPr>
+        <w:spacing w:after="0" w:before="120"/>
+      </w:pPr>
+    </w:p>
+    <w:tbl>
+      <w:tblPr>
+        <w:tblW w:type="dxa" w:w="9360"/>
+        <w:tblBorders>
+          <w:top w:val="single" w:color="auto" w:sz="4"/>
+          <w:left w:val="single" w:color="auto" w:sz="4"/>
+          <w:bottom w:val="single" w:color="auto" w:sz="4"/>
+          <w:right w:val="single" w:color="auto" w:sz="4"/>
+          <w:insideH w:val="single" w:color="auto" w:sz="4"/>
+          <w:insideV w:val="single" w:color="auto" w:sz="4"/>
+        </w:tblBorders>
+      </w:tblPr>
+      <w:tblGrid>
+        <w:gridCol w:w="3120"/>
+        <w:gridCol w:w="6240"/>
+      </w:tblGrid>
+      <w:tr>
+        <w:tc>
+          <w:tcPr>
+            <w:tcW w:type="dxa" w:w="3120"/>
+            <w:tcBorders>
+              <w:top w:val="none" w:sz="0"/>
+              <w:left w:val="none" w:sz="0"/>
+              <w:bottom w:val="single" w:color="2E75B6" w:sz="4"/>
+              <w:right w:val="none" w:sz="0"/>
+            </w:tcBorders>
+            <w:shd w:fill="EBF4F8" w:val="clear"/>
+            <w:tcMar>
+              <w:top w:type="dxa" w:w="80"/>
+              <w:left w:type="dxa" w:w="150"/>
+              <w:bottom w:type="dxa" w:w="80"/>
+              <w:right w:type="dxa" w:w="150"/>
+            </w:tcMar>
+          </w:tcPr>
+          <w:p>
+            <w:r>
+              <w:rPr>
+                <w:rFonts w:ascii="Arial" w:cs="Arial" w:eastAsia="Arial" w:hAnsi="Arial"/>
+                <w:b/>
+                <w:bCs/>
+                <w:color w:val="2E75B6"/>
+                <w:sz w:val="20"/>
+                <w:szCs w:val="20"/>
+              </w:rPr>
+              <w:t xml:space="preserve">Duration: </w:t>
+            </w:r>
+            <w:r>
+              <w:rPr>
+                <w:rFonts w:ascii="Arial" w:cs="Arial" w:eastAsia="Arial" w:hAnsi="Arial"/>
+                <w:color w:val="333333"/>
+                <w:sz w:val="20"/>
+                <w:szCs w:val="20"/>
+              </w:rPr>
+              <w:t xml:space="preserve">3 hours</w:t>
+            </w:r>
+          </w:p>
+        </w:tc>
+        <w:tc>
+          <w:tcPr>
+            <w:tcW w:type="dxa" w:w="6240"/>
+            <w:tcBorders>
+              <w:top w:val="none" w:sz="0"/>
+              <w:left w:val="none" w:sz="0"/>
+              <w:bottom w:val="single" w:color="2E75B6" w:sz="4"/>
+              <w:right w:val="none" w:sz="0"/>
+            </w:tcBorders>
+            <w:shd w:fill="EBF4F8" w:val="clear"/>
+            <w:tcMar>
+              <w:top w:type="dxa" w:w="80"/>
+              <w:left w:type="dxa" w:w="150"/>
+              <w:bottom w:type="dxa" w:w="80"/>
+              <w:right w:type="dxa" w:w="150"/>
+            </w:tcMar>
+          </w:tcPr>
+          <w:p>
+            <w:r>
+              <w:rPr>
+                <w:rFonts w:ascii="Arial" w:cs="Arial" w:eastAsia="Arial" w:hAnsi="Arial"/>
+                <w:b/>
+                <w:bCs/>
+                <w:color w:val="2E75B6"/>
+                <w:sz w:val="20"/>
+                <w:szCs w:val="20"/>
+              </w:rPr>
+              <w:t xml:space="preserve">Goal: </w:t>
+            </w:r>
+            <w:r>
+              <w:rPr>
+                <w:rFonts w:ascii="Arial" w:cs="Arial" w:eastAsia="Arial" w:hAnsi="Arial"/>
+                <w:color w:val="333333"/>
+                <w:sz w:val="20"/>
+                <w:szCs w:val="20"/>
+              </w:rPr>
+              <w:t xml:space="preserve">Students build their first interactive pages — HTML forms that send data to Flask routes via GET, and Python code that reads it with request.args.</w:t>
+            </w:r>
+          </w:p>
+        </w:tc>
+      </w:tr>
+    </w:tbl>
+    <w:p>
+      <w:pPr>
+        <w:spacing w:after="0" w:before="200"/>
+      </w:pPr>
+    </w:p>
+    <w:p>
+      <w:pPr>
+        <w:spacing w:after="100" w:before="300"/>
+      </w:pPr>
+      <w:r>
+        <w:rPr>
+          <w:rFonts w:ascii="Arial" w:cs="Arial" w:eastAsia="Arial" w:hAnsi="Arial"/>
+          <w:b/>
+          <w:bCs/>
+          <w:color w:val="2E75B6"/>
+          <w:sz w:val="24"/>
+          <w:szCs w:val="24"/>
+        </w:rPr>
+        <w:t xml:space="preserve">Time Breakdown</w:t>
+      </w:r>
+    </w:p>
+    <w:p>
+      <w:pPr>
+        <w:spacing w:after="0" w:before="60"/>
+      </w:pPr>
+    </w:p>
+    <w:tbl>
+      <w:tblPr>
+        <w:tblW w:type="dxa" w:w="9360"/>
+        <w:tblBorders>
+          <w:top w:val="single" w:color="auto" w:sz="4"/>
+          <w:left w:val="single" w:color="auto" w:sz="4"/>
+          <w:bottom w:val="single" w:color="auto" w:sz="4"/>
+          <w:right w:val="single" w:color="auto" w:sz="4"/>
+          <w:insideH w:val="single" w:color="auto" w:sz="4"/>
+          <w:insideV w:val="single" w:color="auto" w:sz="4"/>
+        </w:tblBorders>
+      </w:tblPr>
+      <w:tblGrid>
+        <w:gridCol w:w="1400"/>
+        <w:gridCol w:w="2600"/>
+        <w:gridCol w:w="5360"/>
+      </w:tblGrid>
+      <w:tr>
+        <w:tc>
+          <w:tcPr>
+            <w:tcW w:type="dxa" w:w="1400"/>
+            <w:tcBorders>
+              <w:top w:val="single" w:color="E0E0E0" w:sz="1"/>
+              <w:left w:val="single" w:color="E0E0E0" w:sz="1"/>
+              <w:bottom w:val="single" w:color="E0E0E0" w:sz="1"/>
+              <w:right w:val="single" w:color="E0E0E0" w:sz="1"/>
+            </w:tcBorders>
+            <w:shd w:fill="EBF4F8" w:val="clear"/>
+            <w:tcMar>
+              <w:top w:type="dxa" w:w="40"/>
+              <w:left w:type="dxa" w:w="100"/>
+              <w:bottom w:type="dxa" w:w="40"/>
+              <w:right w:type="dxa" w:w="100"/>
+            </w:tcMar>
+          </w:tcPr>
+          <w:p>
+            <w:r>
+              <w:rPr>
+                <w:rFonts w:ascii="Arial" w:cs="Arial" w:eastAsia="Arial" w:hAnsi="Arial"/>
+                <w:b/>
+                <w:bCs/>
+                <w:color w:val="2E75B6"/>
+                <w:sz w:val="19"/>
+                <w:szCs w:val="19"/>
+              </w:rPr>
+              <w:t xml:space="preserve">0:00 – 0:40</w:t>
+            </w:r>
+          </w:p>
+        </w:tc>
+        <w:tc>
+          <w:tcPr>
+            <w:tcW w:type="dxa" w:w="2600"/>
+            <w:tcBorders>
+              <w:top w:val="single" w:color="E0E0E0" w:sz="1"/>
+              <w:left w:val="single" w:color="E0E0E0" w:sz="1"/>
+              <w:bottom w:val="single" w:color="E0E0E0" w:sz="1"/>
+              <w:right w:val="single" w:color="E0E0E0" w:sz="1"/>
+            </w:tcBorders>
+            <w:shd w:fill="EBF4F8" w:val="clear"/>
+            <w:tcMar>
+              <w:top w:type="dxa" w:w="40"/>
+              <w:left w:type="dxa" w:w="100"/>
+              <w:bottom w:type="dxa" w:w="40"/>
+              <w:right w:type="dxa" w:w="100"/>
+            </w:tcMar>
+          </w:tcPr>
+          <w:p>
+            <w:r>
+              <w:rPr>
+                <w:rFonts w:ascii="Arial" w:cs="Arial" w:eastAsia="Arial" w:hAnsi="Arial"/>
+                <w:b/>
+                <w:bCs/>
+                <w:color w:val="333333"/>
+                <w:sz w:val="19"/>
+                <w:szCs w:val="19"/>
+              </w:rPr>
+              <w:t xml:space="preserve">Demo &amp; Lecture</w:t>
+            </w:r>
+          </w:p>
+        </w:tc>
+        <w:tc>
+          <w:tcPr>
+            <w:tcW w:type="dxa" w:w="5360"/>
+            <w:tcBorders>
+              <w:top w:val="single" w:color="E0E0E0" w:sz="1"/>
+              <w:left w:val="single" w:color="E0E0E0" w:sz="1"/>
+              <w:bottom w:val="single" w:color="E0E0E0" w:sz="1"/>
+              <w:right w:val="single" w:color="E0E0E0" w:sz="1"/>
+            </w:tcBorders>
+            <w:shd w:fill="EBF4F8" w:val="clear"/>
+            <w:tcMar>
+              <w:top w:type="dxa" w:w="40"/>
+              <w:left w:type="dxa" w:w="100"/>
+              <w:bottom w:type="dxa" w:w="40"/>
+              <w:right w:type="dxa" w:w="100"/>
+            </w:tcMar>
+          </w:tcPr>
+          <w:p>
+            <w:r>
+              <w:rPr>
+                <w:rFonts w:ascii="Arial" w:cs="Arial" w:eastAsia="Arial" w:hAnsi="Arial"/>
+                <w:color w:val="666666"/>
+                <w:sz w:val="19"/>
+                <w:szCs w:val="19"/>
+              </w:rPr>
+              <w:t xml:space="preserve">Hook, HTML forms, request.args, handling missing input</w:t>
+            </w:r>
+          </w:p>
+        </w:tc>
+      </w:tr>
+      <w:tr>
+        <w:tc>
+          <w:tcPr>
+            <w:tcW w:type="dxa" w:w="1400"/>
+            <w:tcBorders>
+              <w:top w:val="single" w:color="E0E0E0" w:sz="1"/>
+              <w:left w:val="single" w:color="E0E0E0" w:sz="1"/>
+              <w:bottom w:val="single" w:color="E0E0E0" w:sz="1"/>
+              <w:right w:val="single" w:color="E0E0E0" w:sz="1"/>
+            </w:tcBorders>
+            <w:shd w:fill="FFFFFF" w:val="clear"/>
+            <w:tcMar>
+              <w:top w:type="dxa" w:w="40"/>
+              <w:left w:type="dxa" w:w="100"/>
+              <w:bottom w:type="dxa" w:w="40"/>
+              <w:right w:type="dxa" w:w="100"/>
+            </w:tcMar>
+          </w:tcPr>
+          <w:p>
+            <w:r>
+              <w:rPr>
+                <w:rFonts w:ascii="Arial" w:cs="Arial" w:eastAsia="Arial" w:hAnsi="Arial"/>
+                <w:b/>
+                <w:bCs/>
+                <w:color w:val="2E75B6"/>
+                <w:sz w:val="19"/>
+                <w:szCs w:val="19"/>
+              </w:rPr>
+              <w:t xml:space="preserve">0:40 – 0:45</w:t>
+            </w:r>
+          </w:p>
+        </w:tc>
+        <w:tc>
+          <w:tcPr>
+            <w:tcW w:type="dxa" w:w="2600"/>
+            <w:tcBorders>
+              <w:top w:val="single" w:color="E0E0E0" w:sz="1"/>
+              <w:left w:val="single" w:color="E0E0E0" w:sz="1"/>
+              <w:bottom w:val="single" w:color="E0E0E0" w:sz="1"/>
+              <w:right w:val="single" w:color="E0E0E0" w:sz="1"/>
+            </w:tcBorders>
+            <w:shd w:fill="FFFFFF" w:val="clear"/>
+            <w:tcMar>
+              <w:top w:type="dxa" w:w="40"/>
+              <w:left w:type="dxa" w:w="100"/>
+              <w:bottom w:type="dxa" w:w="40"/>
+              <w:right w:type="dxa" w:w="100"/>
+            </w:tcMar>
+          </w:tcPr>
+          <w:p>
+            <w:r>
+              <w:rPr>
+                <w:rFonts w:ascii="Arial" w:cs="Arial" w:eastAsia="Arial" w:hAnsi="Arial"/>
+                <w:b/>
+                <w:bCs/>
+                <w:color w:val="333333"/>
+                <w:sz w:val="19"/>
+                <w:szCs w:val="19"/>
+              </w:rPr>
+              <w:t xml:space="preserve">Mini-Challenge</w:t>
+            </w:r>
+          </w:p>
+        </w:tc>
+        <w:tc>
+          <w:tcPr>
+            <w:tcW w:type="dxa" w:w="5360"/>
+            <w:tcBorders>
+              <w:top w:val="single" w:color="E0E0E0" w:sz="1"/>
+              <w:left w:val="single" w:color="E0E0E0" w:sz="1"/>
+              <w:bottom w:val="single" w:color="E0E0E0" w:sz="1"/>
+              <w:right w:val="single" w:color="E0E0E0" w:sz="1"/>
+            </w:tcBorders>
+            <w:shd w:fill="FFFFFF" w:val="clear"/>
+            <w:tcMar>
+              <w:top w:type="dxa" w:w="40"/>
+              <w:left w:type="dxa" w:w="100"/>
+              <w:bottom w:type="dxa" w:w="40"/>
+              <w:right w:type="dxa" w:w="100"/>
+            </w:tcMar>
+          </w:tcPr>
+          <w:p>
+            <w:r>
+              <w:rPr>
+                <w:rFonts w:ascii="Arial" w:cs="Arial" w:eastAsia="Arial" w:hAnsi="Arial"/>
+                <w:color w:val="666666"/>
+                <w:sz w:val="19"/>
+                <w:szCs w:val="19"/>
+              </w:rPr>
+              <w:t xml:space="preserve">Quick form + greeting route</w:t>
+            </w:r>
+          </w:p>
+        </w:tc>
+      </w:tr>
+      <w:tr>
+        <w:tc>
+          <w:tcPr>
+            <w:tcW w:type="dxa" w:w="1400"/>
+            <w:tcBorders>
+              <w:top w:val="single" w:color="E0E0E0" w:sz="1"/>
+              <w:left w:val="single" w:color="E0E0E0" w:sz="1"/>
+              <w:bottom w:val="single" w:color="E0E0E0" w:sz="1"/>
+              <w:right w:val="single" w:color="E0E0E0" w:sz="1"/>
+            </w:tcBorders>
+            <w:shd w:fill="EBF4F8" w:val="clear"/>
+            <w:tcMar>
+              <w:top w:type="dxa" w:w="40"/>
+              <w:left w:type="dxa" w:w="100"/>
+              <w:bottom w:type="dxa" w:w="40"/>
+              <w:right w:type="dxa" w:w="100"/>
+            </w:tcMar>
+          </w:tcPr>
+          <w:p>
+            <w:r>
+              <w:rPr>
+                <w:rFonts w:ascii="Arial" w:cs="Arial" w:eastAsia="Arial" w:hAnsi="Arial"/>
+                <w:b/>
+                <w:bCs/>
+                <w:color w:val="2E75B6"/>
+                <w:sz w:val="19"/>
+                <w:szCs w:val="19"/>
+              </w:rPr>
+              <w:t xml:space="preserve">0:45 – 0:55</w:t>
+            </w:r>
+          </w:p>
+        </w:tc>
+        <w:tc>
+          <w:tcPr>
+            <w:tcW w:type="dxa" w:w="2600"/>
+            <w:tcBorders>
+              <w:top w:val="single" w:color="E0E0E0" w:sz="1"/>
+              <w:left w:val="single" w:color="E0E0E0" w:sz="1"/>
+              <w:bottom w:val="single" w:color="E0E0E0" w:sz="1"/>
+              <w:right w:val="single" w:color="E0E0E0" w:sz="1"/>
+            </w:tcBorders>
+            <w:shd w:fill="EBF4F8" w:val="clear"/>
+            <w:tcMar>
+              <w:top w:type="dxa" w:w="40"/>
+              <w:left w:type="dxa" w:w="100"/>
+              <w:bottom w:type="dxa" w:w="40"/>
+              <w:right w:type="dxa" w:w="100"/>
+            </w:tcMar>
+          </w:tcPr>
+          <w:p>
+            <w:r>
+              <w:rPr>
+                <w:rFonts w:ascii="Arial" w:cs="Arial" w:eastAsia="Arial" w:hAnsi="Arial"/>
+                <w:b/>
+                <w:bCs/>
+                <w:color w:val="333333"/>
+                <w:sz w:val="19"/>
+                <w:szCs w:val="19"/>
+              </w:rPr>
+              <w:t xml:space="preserve">Break</w:t>
+            </w:r>
+          </w:p>
+        </w:tc>
+        <w:tc>
+          <w:tcPr>
+            <w:tcW w:type="dxa" w:w="5360"/>
+            <w:tcBorders>
+              <w:top w:val="single" w:color="E0E0E0" w:sz="1"/>
+              <w:left w:val="single" w:color="E0E0E0" w:sz="1"/>
+              <w:bottom w:val="single" w:color="E0E0E0" w:sz="1"/>
+              <w:right w:val="single" w:color="E0E0E0" w:sz="1"/>
+            </w:tcBorders>
+            <w:shd w:fill="EBF4F8" w:val="clear"/>
+            <w:tcMar>
+              <w:top w:type="dxa" w:w="40"/>
+              <w:left w:type="dxa" w:w="100"/>
+              <w:bottom w:type="dxa" w:w="40"/>
+              <w:right w:type="dxa" w:w="100"/>
+            </w:tcMar>
+          </w:tcPr>
+          <w:p>
+            <w:r>
+              <w:rPr>
+                <w:rFonts w:ascii="Arial" w:cs="Arial" w:eastAsia="Arial" w:hAnsi="Arial"/>
+                <w:color w:val="666666"/>
+                <w:sz w:val="19"/>
+                <w:szCs w:val="19"/>
+              </w:rPr>
+              <w:t xml:space="preserve"/>
+            </w:r>
+          </w:p>
+        </w:tc>
+      </w:tr>
+      <w:tr>
+        <w:tc>
+          <w:tcPr>
+            <w:tcW w:type="dxa" w:w="1400"/>
+            <w:tcBorders>
+              <w:top w:val="single" w:color="E0E0E0" w:sz="1"/>
+              <w:left w:val="single" w:color="E0E0E0" w:sz="1"/>
+              <w:bottom w:val="single" w:color="E0E0E0" w:sz="1"/>
+              <w:right w:val="single" w:color="E0E0E0" w:sz="1"/>
+            </w:tcBorders>
+            <w:shd w:fill="FFFFFF" w:val="clear"/>
+            <w:tcMar>
+              <w:top w:type="dxa" w:w="40"/>
+              <w:left w:type="dxa" w:w="100"/>
+              <w:bottom w:type="dxa" w:w="40"/>
+              <w:right w:type="dxa" w:w="100"/>
+            </w:tcMar>
+          </w:tcPr>
+          <w:p>
+            <w:r>
+              <w:rPr>
+                <w:rFonts w:ascii="Arial" w:cs="Arial" w:eastAsia="Arial" w:hAnsi="Arial"/>
+                <w:b/>
+                <w:bCs/>
+                <w:color w:val="2E75B6"/>
+                <w:sz w:val="19"/>
+                <w:szCs w:val="19"/>
+              </w:rPr>
+              <w:t xml:space="preserve">0:55 – 1:25</w:t>
+            </w:r>
+          </w:p>
+        </w:tc>
+        <w:tc>
+          <w:tcPr>
+            <w:tcW w:type="dxa" w:w="2600"/>
+            <w:tcBorders>
+              <w:top w:val="single" w:color="E0E0E0" w:sz="1"/>
+              <w:left w:val="single" w:color="E0E0E0" w:sz="1"/>
+              <w:bottom w:val="single" w:color="E0E0E0" w:sz="1"/>
+              <w:right w:val="single" w:color="E0E0E0" w:sz="1"/>
+            </w:tcBorders>
+            <w:shd w:fill="FFFFFF" w:val="clear"/>
+            <w:tcMar>
+              <w:top w:type="dxa" w:w="40"/>
+              <w:left w:type="dxa" w:w="100"/>
+              <w:bottom w:type="dxa" w:w="40"/>
+              <w:right w:type="dxa" w:w="100"/>
+            </w:tcMar>
+          </w:tcPr>
+          <w:p>
+            <w:r>
+              <w:rPr>
+                <w:rFonts w:ascii="Arial" w:cs="Arial" w:eastAsia="Arial" w:hAnsi="Arial"/>
+                <w:b/>
+                <w:bCs/>
+                <w:color w:val="333333"/>
+                <w:sz w:val="19"/>
+                <w:szCs w:val="19"/>
+              </w:rPr>
+              <w:t xml:space="preserve">Guided Practice</w:t>
+            </w:r>
+          </w:p>
+        </w:tc>
+        <w:tc>
+          <w:tcPr>
+            <w:tcW w:type="dxa" w:w="5360"/>
+            <w:tcBorders>
+              <w:top w:val="single" w:color="E0E0E0" w:sz="1"/>
+              <w:left w:val="single" w:color="E0E0E0" w:sz="1"/>
+              <w:bottom w:val="single" w:color="E0E0E0" w:sz="1"/>
+              <w:right w:val="single" w:color="E0E0E0" w:sz="1"/>
+            </w:tcBorders>
+            <w:shd w:fill="FFFFFF" w:val="clear"/>
+            <w:tcMar>
+              <w:top w:type="dxa" w:w="40"/>
+              <w:left w:type="dxa" w:w="100"/>
+              <w:bottom w:type="dxa" w:w="40"/>
+              <w:right w:type="dxa" w:w="100"/>
+            </w:tcMar>
+          </w:tcPr>
+          <w:p>
+            <w:r>
+              <w:rPr>
+                <w:rFonts w:ascii="Arial" w:cs="Arial" w:eastAsia="Arial" w:hAnsi="Arial"/>
+                <w:color w:val="666666"/>
+                <w:sz w:val="19"/>
+                <w:szCs w:val="19"/>
+              </w:rPr>
+              <w:t xml:space="preserve">"Which ___ Are You?" quiz with teacher guidance</w:t>
+            </w:r>
+          </w:p>
+        </w:tc>
+      </w:tr>
+      <w:tr>
+        <w:tc>
+          <w:tcPr>
+            <w:tcW w:type="dxa" w:w="1400"/>
+            <w:tcBorders>
+              <w:top w:val="single" w:color="E0E0E0" w:sz="1"/>
+              <w:left w:val="single" w:color="E0E0E0" w:sz="1"/>
+              <w:bottom w:val="single" w:color="E0E0E0" w:sz="1"/>
+              <w:right w:val="single" w:color="E0E0E0" w:sz="1"/>
+            </w:tcBorders>
+            <w:shd w:fill="EBF4F8" w:val="clear"/>
+            <w:tcMar>
+              <w:top w:type="dxa" w:w="40"/>
+              <w:left w:type="dxa" w:w="100"/>
+              <w:bottom w:type="dxa" w:w="40"/>
+              <w:right w:type="dxa" w:w="100"/>
+            </w:tcMar>
+          </w:tcPr>
+          <w:p>
+            <w:r>
+              <w:rPr>
+                <w:rFonts w:ascii="Arial" w:cs="Arial" w:eastAsia="Arial" w:hAnsi="Arial"/>
+                <w:b/>
+                <w:bCs/>
+                <w:color w:val="2E75B6"/>
+                <w:sz w:val="19"/>
+                <w:szCs w:val="19"/>
+              </w:rPr>
+              <w:t xml:space="preserve">1:25 – 2:45</w:t>
+            </w:r>
+          </w:p>
+        </w:tc>
+        <w:tc>
+          <w:tcPr>
+            <w:tcW w:type="dxa" w:w="2600"/>
+            <w:tcBorders>
+              <w:top w:val="single" w:color="E0E0E0" w:sz="1"/>
+              <w:left w:val="single" w:color="E0E0E0" w:sz="1"/>
+              <w:bottom w:val="single" w:color="E0E0E0" w:sz="1"/>
+              <w:right w:val="single" w:color="E0E0E0" w:sz="1"/>
+            </w:tcBorders>
+            <w:shd w:fill="EBF4F8" w:val="clear"/>
+            <w:tcMar>
+              <w:top w:type="dxa" w:w="40"/>
+              <w:left w:type="dxa" w:w="100"/>
+              <w:bottom w:type="dxa" w:w="40"/>
+              <w:right w:type="dxa" w:w="100"/>
+            </w:tcMar>
+          </w:tcPr>
+          <w:p>
+            <w:r>
+              <w:rPr>
+                <w:rFonts w:ascii="Arial" w:cs="Arial" w:eastAsia="Arial" w:hAnsi="Arial"/>
+                <w:b/>
+                <w:bCs/>
+                <w:color w:val="333333"/>
+                <w:sz w:val="19"/>
+                <w:szCs w:val="19"/>
+              </w:rPr>
+              <w:t xml:space="preserve">Free Practice</w:t>
+            </w:r>
+          </w:p>
+        </w:tc>
+        <w:tc>
+          <w:tcPr>
+            <w:tcW w:type="dxa" w:w="5360"/>
+            <w:tcBorders>
+              <w:top w:val="single" w:color="E0E0E0" w:sz="1"/>
+              <w:left w:val="single" w:color="E0E0E0" w:sz="1"/>
+              <w:bottom w:val="single" w:color="E0E0E0" w:sz="1"/>
+              <w:right w:val="single" w:color="E0E0E0" w:sz="1"/>
+            </w:tcBorders>
+            <w:shd w:fill="EBF4F8" w:val="clear"/>
+            <w:tcMar>
+              <w:top w:type="dxa" w:w="40"/>
+              <w:left w:type="dxa" w:w="100"/>
+              <w:bottom w:type="dxa" w:w="40"/>
+              <w:right w:type="dxa" w:w="100"/>
+            </w:tcMar>
+          </w:tcPr>
+          <w:p>
+            <w:r>
+              <w:rPr>
+                <w:rFonts w:ascii="Arial" w:cs="Arial" w:eastAsia="Arial" w:hAnsi="Arial"/>
+                <w:color w:val="666666"/>
+                <w:sz w:val="19"/>
+                <w:szCs w:val="19"/>
+              </w:rPr>
+              <w:t xml:space="preserve">Smart Search Page project + stretch goals</w:t>
+            </w:r>
+          </w:p>
+        </w:tc>
+      </w:tr>
+      <w:tr>
+        <w:tc>
+          <w:tcPr>
+            <w:tcW w:type="dxa" w:w="1400"/>
+            <w:tcBorders>
+              <w:top w:val="single" w:color="E0E0E0" w:sz="1"/>
+              <w:left w:val="single" w:color="E0E0E0" w:sz="1"/>
+              <w:bottom w:val="single" w:color="E0E0E0" w:sz="1"/>
+              <w:right w:val="single" w:color="E0E0E0" w:sz="1"/>
+            </w:tcBorders>
+            <w:shd w:fill="FFFFFF" w:val="clear"/>
+            <w:tcMar>
+              <w:top w:type="dxa" w:w="40"/>
+              <w:left w:type="dxa" w:w="100"/>
+              <w:bottom w:type="dxa" w:w="40"/>
+              <w:right w:type="dxa" w:w="100"/>
+            </w:tcMar>
+          </w:tcPr>
+          <w:p>
+            <w:r>
+              <w:rPr>
+                <w:rFonts w:ascii="Arial" w:cs="Arial" w:eastAsia="Arial" w:hAnsi="Arial"/>
+                <w:b/>
+                <w:bCs/>
+                <w:color w:val="2E75B6"/>
+                <w:sz w:val="19"/>
+                <w:szCs w:val="19"/>
+              </w:rPr>
+              <w:t xml:space="preserve">2:45 – 3:00</w:t>
+            </w:r>
+          </w:p>
+        </w:tc>
+        <w:tc>
+          <w:tcPr>
+            <w:tcW w:type="dxa" w:w="2600"/>
+            <w:tcBorders>
+              <w:top w:val="single" w:color="E0E0E0" w:sz="1"/>
+              <w:left w:val="single" w:color="E0E0E0" w:sz="1"/>
+              <w:bottom w:val="single" w:color="E0E0E0" w:sz="1"/>
+              <w:right w:val="single" w:color="E0E0E0" w:sz="1"/>
+            </w:tcBorders>
+            <w:shd w:fill="FFFFFF" w:val="clear"/>
+            <w:tcMar>
+              <w:top w:type="dxa" w:w="40"/>
+              <w:left w:type="dxa" w:w="100"/>
+              <w:bottom w:type="dxa" w:w="40"/>
+              <w:right w:type="dxa" w:w="100"/>
+            </w:tcMar>
+          </w:tcPr>
+          <w:p>
+            <w:r>
+              <w:rPr>
+                <w:rFonts w:ascii="Arial" w:cs="Arial" w:eastAsia="Arial" w:hAnsi="Arial"/>
+                <w:b/>
+                <w:bCs/>
+                <w:color w:val="333333"/>
+                <w:sz w:val="19"/>
+                <w:szCs w:val="19"/>
+              </w:rPr>
+              <w:t xml:space="preserve">Wrap-up</w:t>
+            </w:r>
+          </w:p>
+        </w:tc>
+        <w:tc>
+          <w:tcPr>
+            <w:tcW w:type="dxa" w:w="5360"/>
+            <w:tcBorders>
+              <w:top w:val="single" w:color="E0E0E0" w:sz="1"/>
+              <w:left w:val="single" w:color="E0E0E0" w:sz="1"/>
+              <w:bottom w:val="single" w:color="E0E0E0" w:sz="1"/>
+              <w:right w:val="single" w:color="E0E0E0" w:sz="1"/>
+            </w:tcBorders>
+            <w:shd w:fill="FFFFFF" w:val="clear"/>
+            <w:tcMar>
+              <w:top w:type="dxa" w:w="40"/>
+              <w:left w:type="dxa" w:w="100"/>
+              <w:bottom w:type="dxa" w:w="40"/>
+              <w:right w:type="dxa" w:w="100"/>
+            </w:tcMar>
+          </w:tcPr>
+          <w:p>
+            <w:r>
+              <w:rPr>
+                <w:rFonts w:ascii="Arial" w:cs="Arial" w:eastAsia="Arial" w:hAnsi="Arial"/>
+                <w:color w:val="666666"/>
+                <w:sz w:val="19"/>
+                <w:szCs w:val="19"/>
+              </w:rPr>
+              <w:t xml:space="preserve">Show-and-tell, seed next session</w:t>
+            </w:r>
+          </w:p>
+        </w:tc>
+      </w:tr>
+    </w:tbl>
+    <w:p>
+      <w:pPr>
+        <w:spacing w:after="0" w:before="300"/>
+      </w:pPr>
+    </w:p>
+    <w:p>
+      <w:pPr>
+        <w:spacing w:after="80" w:before="240"/>
+      </w:pPr>
+      <w:r>
+        <w:rPr>
+          <w:rFonts w:ascii="Arial" w:cs="Arial" w:eastAsia="Arial" w:hAnsi="Arial"/>
+          <w:sz w:val="22"/>
+          <w:szCs w:val="22"/>
+        </w:rPr>
+        <w:t xml:space="preserve">🎬  </w:t>
+      </w:r>
+      <w:r>
+        <w:rPr>
+          <w:rFonts w:ascii="Arial" w:cs="Arial" w:eastAsia="Arial" w:hAnsi="Arial"/>
+          <w:b/>
+          <w:bCs/>
+          <w:color w:val="1B3A5C"/>
+          <w:sz w:val="22"/>
+          <w:szCs w:val="22"/>
+        </w:rPr>
+        <w:t xml:space="preserve">Block 1 — Demo &amp; Lecture</w:t>
+      </w:r>
+    </w:p>
+    <w:p>
+      <w:pPr>
+        <w:spacing w:after="40" w:before="40"/>
+      </w:pPr>
+      <w:r>
+        <w:rPr>
+          <w:rFonts w:ascii="Arial" w:cs="Arial" w:eastAsia="Arial" w:hAnsi="Arial"/>
+          <w:i/>
+          <w:iCs/>
+          <w:color w:val="666666"/>
+          <w:sz w:val="20"/>
+          <w:szCs w:val="20"/>
+        </w:rPr>
+        <w:t xml:space="preserve">[40 minutes]</w:t>
+      </w:r>
+    </w:p>
+    <w:p>
+      <w:pPr>
+        <w:spacing w:after="0" w:before="100"/>
+      </w:pPr>
+    </w:p>
+    <w:p>
+      <w:pPr>
+        <w:spacing w:after="80" w:before="120"/>
+      </w:pPr>
+      <w:r>
+        <w:rPr>
+          <w:rFonts w:ascii="Arial" w:cs="Arial" w:eastAsia="Arial" w:hAnsi="Arial"/>
+          <w:b/>
+          <w:bCs/>
+          <w:color w:val="1B3A5C"/>
+          <w:sz w:val="22"/>
+          <w:szCs w:val="22"/>
+        </w:rPr>
+        <w:t xml:space="preserve">Opening Hook</w:t>
+      </w:r>
+    </w:p>
+    <w:p>
+      <w:pPr>
+        <w:spacing w:after="40" w:before="40"/>
+      </w:pPr>
+      <w:r>
+        <w:rPr>
+          <w:rFonts w:ascii="Arial" w:cs="Arial" w:eastAsia="Arial" w:hAnsi="Arial"/>
+          <w:i/>
+          <w:iCs/>
+          <w:color w:val="666666"/>
+          <w:sz w:val="20"/>
+          <w:szCs w:val="20"/>
+        </w:rPr>
+        <w:t xml:space="preserve">[5 minutes]</w:t>
+      </w:r>
+    </w:p>
+    <w:p>
+      <w:pPr>
+        <w:spacing w:after="60" w:before="60"/>
+      </w:pPr>
+      <w:r>
+        <w:rPr>
+          <w:rFonts w:ascii="Arial" w:cs="Arial" w:eastAsia="Arial" w:hAnsi="Arial"/>
+          <w:color w:val="333333"/>
+          <w:sz w:val="21"/>
+          <w:szCs w:val="21"/>
+        </w:rPr>
+        <w:t xml:space="preserve">Open Google and search for something. Pause and look at the URL: google.com/search?q=flask+python. Ask: "See that ?q= part? That is your search term living in the URL. Google is just a form that sends your input via the address bar. Today you are building that." Point out that every search engine, every filter page, every "share this link" feature works this way.</w:t>
+      </w:r>
+    </w:p>
+    <w:p>
+      <w:pPr>
+        <w:spacing w:after="0" w:before="100"/>
+      </w:pPr>
+    </w:p>
+    <w:p>
+      <w:pPr>
+        <w:spacing w:after="80" w:before="120"/>
+      </w:pPr>
+      <w:r>
+        <w:rPr>
+          <w:rFonts w:ascii="Arial" w:cs="Arial" w:eastAsia="Arial" w:hAnsi="Arial"/>
+          <w:b/>
+          <w:bCs/>
+          <w:color w:val="1B3A5C"/>
+          <w:sz w:val="22"/>
+          <w:szCs w:val="22"/>
+        </w:rPr>
+        <w:t xml:space="preserve">HTML Forms Recap — The Front-End Side</w:t>
+      </w:r>
+    </w:p>
+    <w:p>
+      <w:pPr>
+        <w:spacing w:after="40" w:before="40"/>
+      </w:pPr>
+      <w:r>
+        <w:rPr>
+          <w:rFonts w:ascii="Arial" w:cs="Arial" w:eastAsia="Arial" w:hAnsi="Arial"/>
+          <w:i/>
+          <w:iCs/>
+          <w:color w:val="666666"/>
+          <w:sz w:val="20"/>
+          <w:szCs w:val="20"/>
+        </w:rPr>
+        <w:t xml:space="preserve">[10 minutes]</w:t>
+      </w:r>
+    </w:p>
+    <w:p>
+      <w:pPr>
+        <w:pStyle w:val="ListParagraph"/>
+        <w:numPr>
+          <w:ilvl w:val="0"/>
+          <w:numId w:val="28"/>
+        </w:numPr>
+        <w:spacing w:after="40" w:before="40"/>
+      </w:pPr>
+      <w:r>
+        <w:rPr>
+          <w:rFonts w:ascii="Arial" w:cs="Arial" w:eastAsia="Arial" w:hAnsi="Arial"/>
+          <w:color w:val="333333"/>
+          <w:sz w:val="21"/>
+          <w:szCs w:val="21"/>
+        </w:rPr>
+        <w:t xml:space="preserve">Build a simple form live in a template: &lt;form&gt;, &lt;input&gt;, &lt;button&gt;</w:t>
+      </w:r>
+    </w:p>
+    <w:p>
+      <w:pPr>
+        <w:pStyle w:val="ListParagraph"/>
+        <w:numPr>
+          <w:ilvl w:val="0"/>
+          <w:numId w:val="28"/>
+        </w:numPr>
+        <w:spacing w:after="40" w:before="40"/>
+      </w:pPr>
+      <w:r>
+        <w:rPr>
+          <w:rFonts w:ascii="Arial" w:cs="Arial" w:eastAsia="Arial" w:hAnsi="Arial"/>
+          <w:color w:val="333333"/>
+          <w:sz w:val="21"/>
+          <w:szCs w:val="21"/>
+        </w:rPr>
+        <w:t xml:space="preserve">Key attributes: action (where does it go?), method="GET" (how does it travel?), name (what is the variable called?)</w:t>
+      </w:r>
+    </w:p>
+    <w:p>
+      <w:pPr>
+        <w:pStyle w:val="ListParagraph"/>
+        <w:numPr>
+          <w:ilvl w:val="0"/>
+          <w:numId w:val="28"/>
+        </w:numPr>
+        <w:spacing w:after="40" w:before="40"/>
+      </w:pPr>
+      <w:r>
+        <w:rPr>
+          <w:rFonts w:ascii="Arial" w:cs="Arial" w:eastAsia="Arial" w:hAnsi="Arial"/>
+          <w:color w:val="333333"/>
+          <w:sz w:val="21"/>
+          <w:szCs w:val="21"/>
+        </w:rPr>
+        <w:t xml:space="preserve">Submit the form and watch the URL change — the form data appears as query parameters</w:t>
+      </w:r>
+    </w:p>
+    <w:p>
+      <w:pPr>
+        <w:pStyle w:val="ListParagraph"/>
+        <w:numPr>
+          <w:ilvl w:val="0"/>
+          <w:numId w:val="28"/>
+        </w:numPr>
+        <w:spacing w:after="40" w:before="40"/>
+      </w:pPr>
+      <w:r>
+        <w:rPr>
+          <w:rFonts w:ascii="Arial" w:cs="Arial" w:eastAsia="Arial" w:hAnsi="Arial"/>
+          <w:color w:val="333333"/>
+          <w:sz w:val="21"/>
+          <w:szCs w:val="21"/>
+        </w:rPr>
+        <w:t xml:space="preserve">Show it in the Network tab: the form just triggers a normal GET request with extras tacked onto the URL</w:t>
+      </w:r>
+    </w:p>
+    <w:p>
+      <w:pPr>
+        <w:pStyle w:val="ListParagraph"/>
+        <w:numPr>
+          <w:ilvl w:val="0"/>
+          <w:numId w:val="28"/>
+        </w:numPr>
+        <w:spacing w:after="40" w:before="40"/>
+      </w:pPr>
+      <w:r>
+        <w:rPr>
+          <w:rFonts w:ascii="Arial" w:cs="Arial" w:eastAsia="Arial" w:hAnsi="Arial"/>
+          <w:color w:val="333333"/>
+          <w:sz w:val="21"/>
+          <w:szCs w:val="21"/>
+        </w:rPr>
+        <w:t xml:space="preserve">Emphasize: the name attribute on the input is what becomes the key in the URL. No name, no data.</w:t>
+      </w:r>
+    </w:p>
+    <w:p>
+      <w:pPr>
+        <w:spacing w:after="0" w:before="100"/>
+      </w:pPr>
+    </w:p>
+    <w:p>
+      <w:pPr>
+        <w:spacing w:after="80" w:before="120"/>
+      </w:pPr>
+      <w:r>
+        <w:rPr>
+          <w:rFonts w:ascii="Arial" w:cs="Arial" w:eastAsia="Arial" w:hAnsi="Arial"/>
+          <w:b/>
+          <w:bCs/>
+          <w:color w:val="1B3A5C"/>
+          <w:sz w:val="22"/>
+          <w:szCs w:val="22"/>
+        </w:rPr>
+        <w:t xml:space="preserve">Reading Form Data in Flask — request.args</w:t>
+      </w:r>
+    </w:p>
+    <w:p>
+      <w:pPr>
+        <w:spacing w:after="40" w:before="40"/>
+      </w:pPr>
+      <w:r>
+        <w:rPr>
+          <w:rFonts w:ascii="Arial" w:cs="Arial" w:eastAsia="Arial" w:hAnsi="Arial"/>
+          <w:i/>
+          <w:iCs/>
+          <w:color w:val="666666"/>
+          <w:sz w:val="20"/>
+          <w:szCs w:val="20"/>
+        </w:rPr>
+        <w:t xml:space="preserve">[10 minutes]</w:t>
+      </w:r>
+    </w:p>
+    <w:p>
+      <w:pPr>
+        <w:pStyle w:val="ListParagraph"/>
+        <w:numPr>
+          <w:ilvl w:val="0"/>
+          <w:numId w:val="29"/>
+        </w:numPr>
+        <w:spacing w:after="40" w:before="40"/>
+      </w:pPr>
+      <w:r>
+        <w:rPr>
+          <w:rFonts w:ascii="Arial" w:cs="Arial" w:eastAsia="Arial" w:hAnsi="Arial"/>
+          <w:color w:val="333333"/>
+          <w:sz w:val="21"/>
+          <w:szCs w:val="21"/>
+        </w:rPr>
+        <w:t xml:space="preserve">Import request from Flask</w:t>
+      </w:r>
+    </w:p>
+    <w:p>
+      <w:pPr>
+        <w:pStyle w:val="ListParagraph"/>
+        <w:numPr>
+          <w:ilvl w:val="0"/>
+          <w:numId w:val="29"/>
+        </w:numPr>
+        <w:spacing w:after="40" w:before="40"/>
+      </w:pPr>
+      <w:r>
+        <w:rPr>
+          <w:rFonts w:ascii="Arial" w:cs="Arial" w:eastAsia="Arial" w:hAnsi="Arial"/>
+          <w:color w:val="333333"/>
+          <w:sz w:val="21"/>
+          <w:szCs w:val="21"/>
+        </w:rPr>
+        <w:t xml:space="preserve">In the route: query = request.args.get('q')</w:t>
+      </w:r>
+    </w:p>
+    <w:p>
+      <w:pPr>
+        <w:pStyle w:val="ListParagraph"/>
+        <w:numPr>
+          <w:ilvl w:val="0"/>
+          <w:numId w:val="29"/>
+        </w:numPr>
+        <w:spacing w:after="40" w:before="40"/>
+      </w:pPr>
+      <w:r>
+        <w:rPr>
+          <w:rFonts w:ascii="Arial" w:cs="Arial" w:eastAsia="Arial" w:hAnsi="Arial"/>
+          <w:color w:val="333333"/>
+          <w:sz w:val="21"/>
+          <w:szCs w:val="21"/>
+        </w:rPr>
+        <w:t xml:space="preserve">Pass the value to a template, display it: "You searched for: {{ query }}"</w:t>
+      </w:r>
+    </w:p>
+    <w:p>
+      <w:pPr>
+        <w:pStyle w:val="ListParagraph"/>
+        <w:numPr>
+          <w:ilvl w:val="0"/>
+          <w:numId w:val="29"/>
+        </w:numPr>
+        <w:spacing w:after="40" w:before="40"/>
+      </w:pPr>
+      <w:r>
+        <w:rPr>
+          <w:rFonts w:ascii="Arial" w:cs="Arial" w:eastAsia="Arial" w:hAnsi="Arial"/>
+          <w:color w:val="333333"/>
+          <w:sz w:val="21"/>
+          <w:szCs w:val="21"/>
+        </w:rPr>
+        <w:t xml:space="preserve">Show what happens when the field is empty — request.args.get() returns None</w:t>
+      </w:r>
+    </w:p>
+    <w:p>
+      <w:pPr>
+        <w:pStyle w:val="ListParagraph"/>
+        <w:numPr>
+          <w:ilvl w:val="0"/>
+          <w:numId w:val="29"/>
+        </w:numPr>
+        <w:spacing w:after="40" w:before="40"/>
+      </w:pPr>
+      <w:r>
+        <w:rPr>
+          <w:rFonts w:ascii="Arial" w:cs="Arial" w:eastAsia="Arial" w:hAnsi="Arial"/>
+          <w:color w:val="333333"/>
+          <w:sz w:val="21"/>
+          <w:szCs w:val="21"/>
+        </w:rPr>
+        <w:t xml:space="preserve">Introduce the default value pattern: request.args.get('q', '') — safe and clean</w:t>
+      </w:r>
+    </w:p>
+    <w:p>
+      <w:pPr>
+        <w:pStyle w:val="ListParagraph"/>
+        <w:numPr>
+          <w:ilvl w:val="0"/>
+          <w:numId w:val="29"/>
+        </w:numPr>
+        <w:spacing w:after="40" w:before="40"/>
+      </w:pPr>
+      <w:r>
+        <w:rPr>
+          <w:rFonts w:ascii="Arial" w:cs="Arial" w:eastAsia="Arial" w:hAnsi="Arial"/>
+          <w:color w:val="333333"/>
+          <w:sz w:val="21"/>
+          <w:szCs w:val="21"/>
+        </w:rPr>
+        <w:t xml:space="preserve">Live demo: submit with data, submit empty, see both behaviors</w:t>
+      </w:r>
+    </w:p>
+    <w:p>
+      <w:pPr>
+        <w:spacing w:after="0" w:before="100"/>
+      </w:pPr>
+    </w:p>
+    <w:p>
+      <w:pPr>
+        <w:spacing w:after="80" w:before="120"/>
+      </w:pPr>
+      <w:r>
+        <w:rPr>
+          <w:rFonts w:ascii="Arial" w:cs="Arial" w:eastAsia="Arial" w:hAnsi="Arial"/>
+          <w:b/>
+          <w:bCs/>
+          <w:color w:val="1B3A5C"/>
+          <w:sz w:val="22"/>
+          <w:szCs w:val="22"/>
+        </w:rPr>
+        <w:t xml:space="preserve">Handling Missing / Bad Input</w:t>
+      </w:r>
+    </w:p>
+    <w:p>
+      <w:pPr>
+        <w:spacing w:after="40" w:before="40"/>
+      </w:pPr>
+      <w:r>
+        <w:rPr>
+          <w:rFonts w:ascii="Arial" w:cs="Arial" w:eastAsia="Arial" w:hAnsi="Arial"/>
+          <w:i/>
+          <w:iCs/>
+          <w:color w:val="666666"/>
+          <w:sz w:val="20"/>
+          <w:szCs w:val="20"/>
+        </w:rPr>
+        <w:t xml:space="preserve">[10 minutes]</w:t>
+      </w:r>
+    </w:p>
+    <w:p>
+      <w:pPr>
+        <w:pStyle w:val="ListParagraph"/>
+        <w:numPr>
+          <w:ilvl w:val="0"/>
+          <w:numId w:val="30"/>
+        </w:numPr>
+        <w:spacing w:after="40" w:before="40"/>
+      </w:pPr>
+      <w:r>
+        <w:rPr>
+          <w:rFonts w:ascii="Arial" w:cs="Arial" w:eastAsia="Arial" w:hAnsi="Arial"/>
+          <w:color w:val="333333"/>
+          <w:sz w:val="21"/>
+          <w:szCs w:val="21"/>
+        </w:rPr>
+        <w:t xml:space="preserve">What if someone visits the results URL directly without submitting the form? They get None.</w:t>
+      </w:r>
+    </w:p>
+    <w:p>
+      <w:pPr>
+        <w:pStyle w:val="ListParagraph"/>
+        <w:numPr>
+          <w:ilvl w:val="0"/>
+          <w:numId w:val="30"/>
+        </w:numPr>
+        <w:spacing w:after="40" w:before="40"/>
+      </w:pPr>
+      <w:r>
+        <w:rPr>
+          <w:rFonts w:ascii="Arial" w:cs="Arial" w:eastAsia="Arial" w:hAnsi="Arial"/>
+          <w:color w:val="333333"/>
+          <w:sz w:val="21"/>
+          <w:szCs w:val="21"/>
+        </w:rPr>
+        <w:t xml:space="preserve">Use {% if %} in the template to show the form when there is no query, and show results when there is one</w:t>
+      </w:r>
+    </w:p>
+    <w:p>
+      <w:pPr>
+        <w:pStyle w:val="ListParagraph"/>
+        <w:numPr>
+          <w:ilvl w:val="0"/>
+          <w:numId w:val="30"/>
+        </w:numPr>
+        <w:spacing w:after="40" w:before="40"/>
+      </w:pPr>
+      <w:r>
+        <w:rPr>
+          <w:rFonts w:ascii="Arial" w:cs="Arial" w:eastAsia="Arial" w:hAnsi="Arial"/>
+          <w:color w:val="333333"/>
+          <w:sz w:val="21"/>
+          <w:szCs w:val="21"/>
+        </w:rPr>
+        <w:t xml:space="preserve">This is their first taste of validation: "Did the user actually give me something to work with?"</w:t>
+      </w:r>
+    </w:p>
+    <w:p>
+      <w:pPr>
+        <w:pStyle w:val="ListParagraph"/>
+        <w:numPr>
+          <w:ilvl w:val="0"/>
+          <w:numId w:val="30"/>
+        </w:numPr>
+        <w:spacing w:after="40" w:before="40"/>
+      </w:pPr>
+      <w:r>
+        <w:rPr>
+          <w:rFonts w:ascii="Arial" w:cs="Arial" w:eastAsia="Arial" w:hAnsi="Arial"/>
+          <w:color w:val="333333"/>
+          <w:sz w:val="21"/>
+          <w:szCs w:val="21"/>
+        </w:rPr>
+        <w:t xml:space="preserve">Show the pattern: one route, two states (empty = show form, filled = show results)</w:t>
+      </w:r>
+    </w:p>
+    <w:tbl>
+      <w:tblPr>
+        <w:tblW w:type="dxa" w:w="9360"/>
+        <w:tblBorders>
+          <w:top w:val="single" w:color="auto" w:sz="4"/>
+          <w:left w:val="single" w:color="auto" w:sz="4"/>
+          <w:bottom w:val="single" w:color="auto" w:sz="4"/>
+          <w:right w:val="single" w:color="auto" w:sz="4"/>
+          <w:insideH w:val="single" w:color="auto" w:sz="4"/>
+          <w:insideV w:val="single" w:color="auto" w:sz="4"/>
+        </w:tblBorders>
+      </w:tblPr>
+      <w:tblGrid>
+        <w:gridCol w:w="9360"/>
+      </w:tblGrid>
+      <w:tr>
+        <w:tc>
+          <w:tcPr>
+            <w:tcW w:type="dxa" w:w="9360"/>
+            <w:tcBorders>
+              <w:top w:val="none" w:sz="0"/>
+              <w:left w:val="single" w:color="2D8C46" w:sz="12"/>
+              <w:bottom w:val="none" w:sz="0"/>
+              <w:right w:val="none" w:sz="0"/>
+            </w:tcBorders>
+            <w:shd w:fill="FFF8E1" w:val="clear"/>
+            <w:tcMar>
+              <w:top w:type="dxa" w:w="100"/>
+              <w:left w:type="dxa" w:w="200"/>
+              <w:bottom w:type="dxa" w:w="100"/>
+              <w:right w:type="dxa" w:w="200"/>
+            </w:tcMar>
+          </w:tcPr>
+          <w:p>
+            <w:r>
+              <w:rPr>
+                <w:rFonts w:ascii="Arial" w:cs="Arial" w:eastAsia="Arial" w:hAnsi="Arial"/>
+                <w:b/>
+                <w:bCs/>
+                <w:color w:val="2D8C46"/>
+                <w:sz w:val="21"/>
+                <w:szCs w:val="21"/>
+              </w:rPr>
+              <w:t xml:space="preserve">Tip: </w:t>
+            </w:r>
+            <w:r>
+              <w:rPr>
+                <w:rFonts w:ascii="Arial" w:cs="Arial" w:eastAsia="Arial" w:hAnsi="Arial"/>
+                <w:color w:val="333333"/>
+                <w:sz w:val="21"/>
+                <w:szCs w:val="21"/>
+              </w:rPr>
+              <w:t xml:space="preserve">The "one route, two states" pattern is a design concept they will reuse throughout the course. Do not over-formalize it — just show it working and let them absorb it.</w:t>
+            </w:r>
+          </w:p>
+        </w:tc>
+      </w:tr>
+    </w:tbl>
+    <w:p>
+      <w:pPr>
+        <w:spacing w:after="0" w:before="200"/>
+      </w:pPr>
+    </w:p>
+    <w:p>
+      <w:pPr>
+        <w:spacing w:after="80" w:before="240"/>
+      </w:pPr>
+      <w:r>
+        <w:rPr>
+          <w:rFonts w:ascii="Arial" w:cs="Arial" w:eastAsia="Arial" w:hAnsi="Arial"/>
+          <w:sz w:val="22"/>
+          <w:szCs w:val="22"/>
+        </w:rPr>
+        <w:t xml:space="preserve">⚡  </w:t>
+      </w:r>
+      <w:r>
+        <w:rPr>
+          <w:rFonts w:ascii="Arial" w:cs="Arial" w:eastAsia="Arial" w:hAnsi="Arial"/>
+          <w:b/>
+          <w:bCs/>
+          <w:color w:val="D4772C"/>
+          <w:sz w:val="22"/>
+          <w:szCs w:val="22"/>
+        </w:rPr>
+        <w:t xml:space="preserve">Mini-Challenge</w:t>
+      </w:r>
+    </w:p>
+    <w:p>
+      <w:pPr>
+        <w:spacing w:after="40" w:before="40"/>
+      </w:pPr>
+      <w:r>
+        <w:rPr>
+          <w:rFonts w:ascii="Arial" w:cs="Arial" w:eastAsia="Arial" w:hAnsi="Arial"/>
+          <w:i/>
+          <w:iCs/>
+          <w:color w:val="666666"/>
+          <w:sz w:val="20"/>
+          <w:szCs w:val="20"/>
+        </w:rPr>
+        <w:t xml:space="preserve">[5 minutes]</w:t>
+      </w:r>
+    </w:p>
+    <w:p>
+      <w:pPr>
+        <w:spacing w:after="60" w:before="60"/>
+      </w:pPr>
+      <w:r>
+        <w:rPr>
+          <w:rFonts w:ascii="Arial" w:cs="Arial" w:eastAsia="Arial" w:hAnsi="Arial"/>
+          <w:color w:val="333333"/>
+          <w:sz w:val="21"/>
+          <w:szCs w:val="21"/>
+        </w:rPr>
+        <w:t xml:space="preserve">"Build a route /hello with a form that has a name field. When submitted, the page should say 'Hello, (name)!' — and if the name is empty, it should say 'Hello, stranger!' You have 3 minutes."</w:t>
+      </w:r>
+    </w:p>
+    <w:p>
+      <w:pPr>
+        <w:spacing w:after="0" w:before="200"/>
+      </w:pPr>
+    </w:p>
+    <w:p>
+      <w:pPr>
+        <w:spacing w:after="80" w:before="240"/>
+      </w:pPr>
+      <w:r>
+        <w:rPr>
+          <w:rFonts w:ascii="Arial" w:cs="Arial" w:eastAsia="Arial" w:hAnsi="Arial"/>
+          <w:sz w:val="22"/>
+          <w:szCs w:val="22"/>
+        </w:rPr>
+        <w:t xml:space="preserve">☕  </w:t>
+      </w:r>
+      <w:r>
+        <w:rPr>
+          <w:rFonts w:ascii="Arial" w:cs="Arial" w:eastAsia="Arial" w:hAnsi="Arial"/>
+          <w:b/>
+          <w:bCs/>
+          <w:color w:val="666666"/>
+          <w:sz w:val="22"/>
+          <w:szCs w:val="22"/>
+        </w:rPr>
+        <w:t xml:space="preserve">Break</w:t>
+      </w:r>
+    </w:p>
+    <w:p>
+      <w:pPr>
+        <w:spacing w:after="40" w:before="40"/>
+      </w:pPr>
+      <w:r>
+        <w:rPr>
+          <w:rFonts w:ascii="Arial" w:cs="Arial" w:eastAsia="Arial" w:hAnsi="Arial"/>
+          <w:i/>
+          <w:iCs/>
+          <w:color w:val="666666"/>
+          <w:sz w:val="20"/>
+          <w:szCs w:val="20"/>
+        </w:rPr>
+        <w:t xml:space="preserve">[10 minutes]</w:t>
+      </w:r>
+    </w:p>
+    <w:p>
+      <w:pPr>
+        <w:spacing w:after="0" w:before="200"/>
+      </w:pPr>
+    </w:p>
+    <w:p>
+      <w:pPr>
+        <w:spacing w:after="80" w:before="240"/>
+      </w:pPr>
+      <w:r>
+        <w:rPr>
+          <w:rFonts w:ascii="Arial" w:cs="Arial" w:eastAsia="Arial" w:hAnsi="Arial"/>
+          <w:sz w:val="22"/>
+          <w:szCs w:val="22"/>
+        </w:rPr>
+        <w:t xml:space="preserve">🛠  </w:t>
+      </w:r>
+      <w:r>
+        <w:rPr>
+          <w:rFonts w:ascii="Arial" w:cs="Arial" w:eastAsia="Arial" w:hAnsi="Arial"/>
+          <w:b/>
+          <w:bCs/>
+          <w:color w:val="1B3A5C"/>
+          <w:sz w:val="22"/>
+          <w:szCs w:val="22"/>
+        </w:rPr>
+        <w:t xml:space="preserve">Block 2 — Guided Practice</w:t>
+      </w:r>
+    </w:p>
+    <w:p>
+      <w:pPr>
+        <w:spacing w:after="40" w:before="40"/>
+      </w:pPr>
+      <w:r>
+        <w:rPr>
+          <w:rFonts w:ascii="Arial" w:cs="Arial" w:eastAsia="Arial" w:hAnsi="Arial"/>
+          <w:i/>
+          <w:iCs/>
+          <w:color w:val="666666"/>
+          <w:sz w:val="20"/>
+          <w:szCs w:val="20"/>
+        </w:rPr>
+        <w:t xml:space="preserve">[30 minutes]</w:t>
+      </w:r>
+    </w:p>
+    <w:p>
+      <w:pPr>
+        <w:spacing w:after="0" w:before="80"/>
+      </w:pPr>
+    </w:p>
+    <w:p>
+      <w:pPr>
+        <w:spacing w:after="80" w:before="120"/>
+      </w:pPr>
+      <w:r>
+        <w:rPr>
+          <w:rFonts w:ascii="Arial" w:cs="Arial" w:eastAsia="Arial" w:hAnsi="Arial"/>
+          <w:b/>
+          <w:bCs/>
+          <w:color w:val="1B3A5C"/>
+          <w:sz w:val="22"/>
+          <w:szCs w:val="22"/>
+        </w:rPr>
+        <w:t xml:space="preserve">Project: "Which ___ Are You?" Quiz</w:t>
+      </w:r>
+    </w:p>
+    <w:p>
+      <w:pPr>
+        <w:spacing w:after="60" w:before="60"/>
+      </w:pPr>
+      <w:r>
+        <w:rPr>
+          <w:rFonts w:ascii="Arial" w:cs="Arial" w:eastAsia="Arial" w:hAnsi="Arial"/>
+          <w:color w:val="333333"/>
+          <w:sz w:val="21"/>
+          <w:szCs w:val="21"/>
+        </w:rPr>
+        <w:t xml:space="preserve">Students build a simple personality quiz where the user answers questions via form inputs and gets a result. Teacher walks through the first question together, then students continue on their own. The theme is up to them — "Which Pokémon are you?", "Which music genre matches your personality?", "What is your coding spirit animal?" — whatever keeps them engaged.</w:t>
+      </w:r>
+    </w:p>
+    <w:p>
+      <w:pPr>
+        <w:spacing w:after="0" w:before="60"/>
+      </w:pPr>
+    </w:p>
+    <w:p>
+      <w:pPr>
+        <w:spacing w:after="60" w:before="80"/>
+      </w:pPr>
+      <w:r>
+        <w:rPr>
+          <w:rFonts w:ascii="Arial" w:cs="Arial" w:eastAsia="Arial" w:hAnsi="Arial"/>
+          <w:b/>
+          <w:bCs/>
+          <w:color w:val="333333"/>
+          <w:sz w:val="21"/>
+          <w:szCs w:val="21"/>
+        </w:rPr>
+        <w:t xml:space="preserve">Requirements:</w:t>
+      </w:r>
+    </w:p>
+    <w:p>
+      <w:pPr>
+        <w:pStyle w:val="ListParagraph"/>
+        <w:numPr>
+          <w:ilvl w:val="0"/>
+          <w:numId w:val="31"/>
+        </w:numPr>
+        <w:spacing w:after="40" w:before="40"/>
+      </w:pPr>
+      <w:r>
+        <w:rPr>
+          <w:rFonts w:ascii="Arial" w:cs="Arial" w:eastAsia="Arial" w:hAnsi="Arial"/>
+          <w:color w:val="333333"/>
+          <w:sz w:val="21"/>
+          <w:szCs w:val="21"/>
+        </w:rPr>
+        <w:t xml:space="preserve">A quiz route that displays a form with at least 3 questions (can be dropdowns &lt;select&gt;, text inputs, or radio buttons)</w:t>
+      </w:r>
+    </w:p>
+    <w:p>
+      <w:pPr>
+        <w:pStyle w:val="ListParagraph"/>
+        <w:numPr>
+          <w:ilvl w:val="0"/>
+          <w:numId w:val="31"/>
+        </w:numPr>
+        <w:spacing w:after="40" w:before="40"/>
+      </w:pPr>
+      <w:r>
+        <w:rPr>
+          <w:rFonts w:ascii="Arial" w:cs="Arial" w:eastAsia="Arial" w:hAnsi="Arial"/>
+          <w:color w:val="333333"/>
+          <w:sz w:val="21"/>
+          <w:szCs w:val="21"/>
+        </w:rPr>
+        <w:t xml:space="preserve">The form submits via GET to a results route</w:t>
+      </w:r>
+    </w:p>
+    <w:p>
+      <w:pPr>
+        <w:pStyle w:val="ListParagraph"/>
+        <w:numPr>
+          <w:ilvl w:val="0"/>
+          <w:numId w:val="31"/>
+        </w:numPr>
+        <w:spacing w:after="40" w:before="40"/>
+      </w:pPr>
+      <w:r>
+        <w:rPr>
+          <w:rFonts w:ascii="Arial" w:cs="Arial" w:eastAsia="Arial" w:hAnsi="Arial"/>
+          <w:color w:val="333333"/>
+          <w:sz w:val="21"/>
+          <w:szCs w:val="21"/>
+        </w:rPr>
+        <w:t xml:space="preserve">The results route reads all answers with request.args.get()</w:t>
+      </w:r>
+    </w:p>
+    <w:p>
+      <w:pPr>
+        <w:pStyle w:val="ListParagraph"/>
+        <w:numPr>
+          <w:ilvl w:val="0"/>
+          <w:numId w:val="31"/>
+        </w:numPr>
+        <w:spacing w:after="40" w:before="40"/>
+      </w:pPr>
+      <w:r>
+        <w:rPr>
+          <w:rFonts w:ascii="Arial" w:cs="Arial" w:eastAsia="Arial" w:hAnsi="Arial"/>
+          <w:color w:val="333333"/>
+          <w:sz w:val="21"/>
+          <w:szCs w:val="21"/>
+        </w:rPr>
+        <w:t xml:space="preserve">Based on the answers, display a different result (use {% if %} / {% elif %} in the template)</w:t>
+      </w:r>
+    </w:p>
+    <w:p>
+      <w:pPr>
+        <w:pStyle w:val="ListParagraph"/>
+        <w:numPr>
+          <w:ilvl w:val="0"/>
+          <w:numId w:val="31"/>
+        </w:numPr>
+        <w:spacing w:after="40" w:before="40"/>
+      </w:pPr>
+      <w:r>
+        <w:rPr>
+          <w:rFonts w:ascii="Arial" w:cs="Arial" w:eastAsia="Arial" w:hAnsi="Arial"/>
+          <w:color w:val="333333"/>
+          <w:sz w:val="21"/>
+          <w:szCs w:val="21"/>
+        </w:rPr>
+        <w:t xml:space="preserve">The result page should show what the user picked alongside the quiz result</w:t>
+      </w:r>
+    </w:p>
+    <w:tbl>
+      <w:tblPr>
+        <w:tblW w:type="dxa" w:w="9360"/>
+        <w:tblBorders>
+          <w:top w:val="single" w:color="auto" w:sz="4"/>
+          <w:left w:val="single" w:color="auto" w:sz="4"/>
+          <w:bottom w:val="single" w:color="auto" w:sz="4"/>
+          <w:right w:val="single" w:color="auto" w:sz="4"/>
+          <w:insideH w:val="single" w:color="auto" w:sz="4"/>
+          <w:insideV w:val="single" w:color="auto" w:sz="4"/>
+        </w:tblBorders>
+      </w:tblPr>
+      <w:tblGrid>
+        <w:gridCol w:w="9360"/>
+      </w:tblGrid>
+      <w:tr>
+        <w:tc>
+          <w:tcPr>
+            <w:tcW w:type="dxa" w:w="9360"/>
+            <w:tcBorders>
+              <w:top w:val="none" w:sz="0"/>
+              <w:left w:val="single" w:color="2D8C46" w:sz="12"/>
+              <w:bottom w:val="none" w:sz="0"/>
+              <w:right w:val="none" w:sz="0"/>
+            </w:tcBorders>
+            <w:shd w:fill="FFF8E1" w:val="clear"/>
+            <w:tcMar>
+              <w:top w:type="dxa" w:w="100"/>
+              <w:left w:type="dxa" w:w="200"/>
+              <w:bottom w:type="dxa" w:w="100"/>
+              <w:right w:type="dxa" w:w="200"/>
+            </w:tcMar>
+          </w:tcPr>
+          <w:p>
+            <w:r>
+              <w:rPr>
+                <w:rFonts w:ascii="Arial" w:cs="Arial" w:eastAsia="Arial" w:hAnsi="Arial"/>
+                <w:b/>
+                <w:bCs/>
+                <w:color w:val="2D8C46"/>
+                <w:sz w:val="21"/>
+                <w:szCs w:val="21"/>
+              </w:rPr>
+              <w:t xml:space="preserve">Tip: </w:t>
+            </w:r>
+            <w:r>
+              <w:rPr>
+                <w:rFonts w:ascii="Arial" w:cs="Arial" w:eastAsia="Arial" w:hAnsi="Arial"/>
+                <w:color w:val="333333"/>
+                <w:sz w:val="21"/>
+                <w:szCs w:val="21"/>
+              </w:rPr>
+              <w:t xml:space="preserve">Most common issues during circulation: forgetting the name attribute on inputs, the form action pointing to the wrong route, or trying to read request.args without importing request.</w:t>
+            </w:r>
+          </w:p>
+        </w:tc>
+      </w:tr>
+    </w:tbl>
+    <w:p>
+      <w:pPr>
+        <w:spacing w:after="0" w:before="200"/>
+      </w:pPr>
+    </w:p>
+    <w:p>
+      <w:pPr>
+        <w:spacing w:after="80" w:before="240"/>
+      </w:pPr>
+      <w:r>
+        <w:rPr>
+          <w:rFonts w:ascii="Arial" w:cs="Arial" w:eastAsia="Arial" w:hAnsi="Arial"/>
+          <w:sz w:val="22"/>
+          <w:szCs w:val="22"/>
+        </w:rPr>
+        <w:t xml:space="preserve">🚀  </w:t>
+      </w:r>
+      <w:r>
+        <w:rPr>
+          <w:rFonts w:ascii="Arial" w:cs="Arial" w:eastAsia="Arial" w:hAnsi="Arial"/>
+          <w:b/>
+          <w:bCs/>
+          <w:color w:val="1B3A5C"/>
+          <w:sz w:val="22"/>
+          <w:szCs w:val="22"/>
+        </w:rPr>
+        <w:t xml:space="preserve">Block 3 — Free Practice</w:t>
+      </w:r>
+    </w:p>
+    <w:p>
+      <w:pPr>
+        <w:spacing w:after="40" w:before="40"/>
+      </w:pPr>
+      <w:r>
+        <w:rPr>
+          <w:rFonts w:ascii="Arial" w:cs="Arial" w:eastAsia="Arial" w:hAnsi="Arial"/>
+          <w:i/>
+          <w:iCs/>
+          <w:color w:val="666666"/>
+          <w:sz w:val="20"/>
+          <w:szCs w:val="20"/>
+        </w:rPr>
+        <w:t xml:space="preserve">[80 minutes]</w:t>
+      </w:r>
+    </w:p>
+    <w:p>
+      <w:pPr>
+        <w:spacing w:after="0" w:before="80"/>
+      </w:pPr>
+    </w:p>
+    <w:p>
+      <w:pPr>
+        <w:spacing w:after="80" w:before="120"/>
+      </w:pPr>
+      <w:r>
+        <w:rPr>
+          <w:rFonts w:ascii="Arial" w:cs="Arial" w:eastAsia="Arial" w:hAnsi="Arial"/>
+          <w:b/>
+          <w:bCs/>
+          <w:color w:val="1B3A5C"/>
+          <w:sz w:val="22"/>
+          <w:szCs w:val="22"/>
+        </w:rPr>
+        <w:t xml:space="preserve">Core Challenge: "Smart Search Page"</w:t>
+      </w:r>
+    </w:p>
+    <w:p>
+      <w:pPr>
+        <w:spacing w:after="60" w:before="60"/>
+      </w:pPr>
+      <w:r>
+        <w:rPr>
+          <w:rFonts w:ascii="Arial" w:cs="Arial" w:eastAsia="Arial" w:hAnsi="Arial"/>
+          <w:color w:val="333333"/>
+          <w:sz w:val="21"/>
+          <w:szCs w:val="21"/>
+        </w:rPr>
+        <w:t xml:space="preserve">Build a Flask app with a search/filter feature. Students pick their own dataset (a list of dicts in Python — movies, games, recipes, songs, whatever they like).</w:t>
+      </w:r>
+    </w:p>
+    <w:p>
+      <w:pPr>
+        <w:spacing w:after="0" w:before="60"/>
+      </w:pPr>
+    </w:p>
+    <w:p>
+      <w:pPr>
+        <w:spacing w:after="60" w:before="80"/>
+      </w:pPr>
+      <w:r>
+        <w:rPr>
+          <w:rFonts w:ascii="Arial" w:cs="Arial" w:eastAsia="Arial" w:hAnsi="Arial"/>
+          <w:b/>
+          <w:bCs/>
+          <w:color w:val="333333"/>
+          <w:sz w:val="21"/>
+          <w:szCs w:val="21"/>
+        </w:rPr>
+        <w:t xml:space="preserve">Requirements:</w:t>
+      </w:r>
+    </w:p>
+    <w:p>
+      <w:pPr>
+        <w:pStyle w:val="ListParagraph"/>
+        <w:numPr>
+          <w:ilvl w:val="0"/>
+          <w:numId w:val="32"/>
+        </w:numPr>
+        <w:spacing w:after="40" w:before="40"/>
+      </w:pPr>
+      <w:r>
+        <w:rPr>
+          <w:rFonts w:ascii="Arial" w:cs="Arial" w:eastAsia="Arial" w:hAnsi="Arial"/>
+          <w:color w:val="333333"/>
+          <w:sz w:val="21"/>
+          <w:szCs w:val="21"/>
+        </w:rPr>
+        <w:t xml:space="preserve">A home page with a search form (text input + submit button, method GET)</w:t>
+      </w:r>
+    </w:p>
+    <w:p>
+      <w:pPr>
+        <w:pStyle w:val="ListParagraph"/>
+        <w:numPr>
+          <w:ilvl w:val="0"/>
+          <w:numId w:val="32"/>
+        </w:numPr>
+        <w:spacing w:after="40" w:before="40"/>
+      </w:pPr>
+      <w:r>
+        <w:rPr>
+          <w:rFonts w:ascii="Arial" w:cs="Arial" w:eastAsia="Arial" w:hAnsi="Arial"/>
+          <w:color w:val="333333"/>
+          <w:sz w:val="21"/>
+          <w:szCs w:val="21"/>
+        </w:rPr>
+        <w:t xml:space="preserve">A results page that filters the dataset based on what the user typed</w:t>
+      </w:r>
+    </w:p>
+    <w:p>
+      <w:pPr>
+        <w:pStyle w:val="ListParagraph"/>
+        <w:numPr>
+          <w:ilvl w:val="0"/>
+          <w:numId w:val="32"/>
+        </w:numPr>
+        <w:spacing w:after="40" w:before="40"/>
+      </w:pPr>
+      <w:r>
+        <w:rPr>
+          <w:rFonts w:ascii="Arial" w:cs="Arial" w:eastAsia="Arial" w:hAnsi="Arial"/>
+          <w:color w:val="333333"/>
+          <w:sz w:val="21"/>
+          <w:szCs w:val="21"/>
+        </w:rPr>
+        <w:t xml:space="preserve">The filtering should actually work — loop through the list and check if the search term appears in the item's name or description</w:t>
+      </w:r>
+    </w:p>
+    <w:p>
+      <w:pPr>
+        <w:pStyle w:val="ListParagraph"/>
+        <w:numPr>
+          <w:ilvl w:val="0"/>
+          <w:numId w:val="32"/>
+        </w:numPr>
+        <w:spacing w:after="40" w:before="40"/>
+      </w:pPr>
+      <w:r>
+        <w:rPr>
+          <w:rFonts w:ascii="Arial" w:cs="Arial" w:eastAsia="Arial" w:hAnsi="Arial"/>
+          <w:color w:val="333333"/>
+          <w:sz w:val="21"/>
+          <w:szCs w:val="21"/>
+        </w:rPr>
+        <w:t xml:space="preserve">Display matching results in the template with {% for %}, and show "No results found" with {% if %} when nothing matches</w:t>
+      </w:r>
+    </w:p>
+    <w:p>
+      <w:pPr>
+        <w:pStyle w:val="ListParagraph"/>
+        <w:numPr>
+          <w:ilvl w:val="0"/>
+          <w:numId w:val="32"/>
+        </w:numPr>
+        <w:spacing w:after="40" w:before="40"/>
+      </w:pPr>
+      <w:r>
+        <w:rPr>
+          <w:rFonts w:ascii="Arial" w:cs="Arial" w:eastAsia="Arial" w:hAnsi="Arial"/>
+          <w:color w:val="333333"/>
+          <w:sz w:val="21"/>
+          <w:szCs w:val="21"/>
+        </w:rPr>
+        <w:t xml:space="preserve">The search term should persist in the URL so they can share/bookmark a search</w:t>
+      </w:r>
+    </w:p>
+    <w:p>
+      <w:pPr>
+        <w:spacing w:after="0" w:before="120"/>
+      </w:pPr>
+    </w:p>
+    <w:p>
+      <w:pPr>
+        <w:spacing w:after="60" w:before="80"/>
+      </w:pPr>
+      <w:r>
+        <w:rPr>
+          <w:rFonts w:ascii="Arial" w:cs="Arial" w:eastAsia="Arial" w:hAnsi="Arial"/>
+          <w:b/>
+          <w:bCs/>
+          <w:color w:val="2D8C46"/>
+          <w:sz w:val="21"/>
+          <w:szCs w:val="21"/>
+        </w:rPr>
+        <w:t xml:space="preserve">Stretch Goals (fast finishers):</w:t>
+      </w:r>
+    </w:p>
+    <w:p>
+      <w:pPr>
+        <w:pStyle w:val="ListParagraph"/>
+        <w:numPr>
+          <w:ilvl w:val="0"/>
+          <w:numId w:val="33"/>
+        </w:numPr>
+        <w:spacing w:after="40" w:before="40"/>
+      </w:pPr>
+      <w:r>
+        <w:rPr>
+          <w:rFonts w:ascii="Arial" w:cs="Arial" w:eastAsia="Arial" w:hAnsi="Arial"/>
+          <w:color w:val="333333"/>
+          <w:sz w:val="21"/>
+          <w:szCs w:val="21"/>
+        </w:rPr>
+        <w:t xml:space="preserve">Add a second filter — for example, a dropdown for category/genre that narrows results further</w:t>
+      </w:r>
+    </w:p>
+    <w:p>
+      <w:pPr>
+        <w:pStyle w:val="ListParagraph"/>
+        <w:numPr>
+          <w:ilvl w:val="0"/>
+          <w:numId w:val="33"/>
+        </w:numPr>
+        <w:spacing w:after="40" w:before="40"/>
+      </w:pPr>
+      <w:r>
+        <w:rPr>
+          <w:rFonts w:ascii="Arial" w:cs="Arial" w:eastAsia="Arial" w:hAnsi="Arial"/>
+          <w:color w:val="333333"/>
+          <w:sz w:val="21"/>
+          <w:szCs w:val="21"/>
+        </w:rPr>
+        <w:t xml:space="preserve">Show how many results were found: "Found 3 matches for 'adventure'"</w:t>
+      </w:r>
+    </w:p>
+    <w:p>
+      <w:pPr>
+        <w:pStyle w:val="ListParagraph"/>
+        <w:numPr>
+          <w:ilvl w:val="0"/>
+          <w:numId w:val="33"/>
+        </w:numPr>
+        <w:spacing w:after="40" w:before="40"/>
+      </w:pPr>
+      <w:r>
+        <w:rPr>
+          <w:rFonts w:ascii="Arial" w:cs="Arial" w:eastAsia="Arial" w:hAnsi="Arial"/>
+          <w:color w:val="333333"/>
+          <w:sz w:val="21"/>
+          <w:szCs w:val="21"/>
+        </w:rPr>
+        <w:t xml:space="preserve">Make the search case-insensitive (.lower() — they know this from core Python)</w:t>
+      </w:r>
+    </w:p>
+    <w:p>
+      <w:pPr>
+        <w:pStyle w:val="ListParagraph"/>
+        <w:numPr>
+          <w:ilvl w:val="0"/>
+          <w:numId w:val="33"/>
+        </w:numPr>
+        <w:spacing w:after="40" w:before="40"/>
+      </w:pPr>
+      <w:r>
+        <w:rPr>
+          <w:rFonts w:ascii="Arial" w:cs="Arial" w:eastAsia="Arial" w:hAnsi="Arial"/>
+          <w:color w:val="333333"/>
+          <w:sz w:val="21"/>
+          <w:szCs w:val="21"/>
+        </w:rPr>
+        <w:t xml:space="preserve">Pre-fill the search box with the current query using the value attribute on the &lt;input&gt; so it does not clear after submitting</w:t>
+      </w:r>
+    </w:p>
+    <w:tbl>
+      <w:tblPr>
+        <w:tblW w:type="dxa" w:w="9360"/>
+        <w:tblBorders>
+          <w:top w:val="single" w:color="auto" w:sz="4"/>
+          <w:left w:val="single" w:color="auto" w:sz="4"/>
+          <w:bottom w:val="single" w:color="auto" w:sz="4"/>
+          <w:right w:val="single" w:color="auto" w:sz="4"/>
+          <w:insideH w:val="single" w:color="auto" w:sz="4"/>
+          <w:insideV w:val="single" w:color="auto" w:sz="4"/>
+        </w:tblBorders>
+      </w:tblPr>
+      <w:tblGrid>
+        <w:gridCol w:w="9360"/>
+      </w:tblGrid>
+      <w:tr>
+        <w:tc>
+          <w:tcPr>
+            <w:tcW w:type="dxa" w:w="9360"/>
+            <w:tcBorders>
+              <w:top w:val="none" w:sz="0"/>
+              <w:left w:val="single" w:color="2D8C46" w:sz="12"/>
+              <w:bottom w:val="none" w:sz="0"/>
+              <w:right w:val="none" w:sz="0"/>
+            </w:tcBorders>
+            <w:shd w:fill="FFF8E1" w:val="clear"/>
+            <w:tcMar>
+              <w:top w:type="dxa" w:w="100"/>
+              <w:left w:type="dxa" w:w="200"/>
+              <w:bottom w:type="dxa" w:w="100"/>
+              <w:right w:type="dxa" w:w="200"/>
+            </w:tcMar>
+          </w:tcPr>
+          <w:p>
+            <w:r>
+              <w:rPr>
+                <w:rFonts w:ascii="Arial" w:cs="Arial" w:eastAsia="Arial" w:hAnsi="Arial"/>
+                <w:b/>
+                <w:bCs/>
+                <w:color w:val="2D8C46"/>
+                <w:sz w:val="21"/>
+                <w:szCs w:val="21"/>
+              </w:rPr>
+              <w:t xml:space="preserve">Tip: </w:t>
+            </w:r>
+            <w:r>
+              <w:rPr>
+                <w:rFonts w:ascii="Arial" w:cs="Arial" w:eastAsia="Arial" w:hAnsi="Arial"/>
+                <w:color w:val="333333"/>
+                <w:sz w:val="21"/>
+                <w:szCs w:val="21"/>
+              </w:rPr>
+              <w:t xml:space="preserve">The pre-fill stretch goal is worth nudging fast finishers toward — it is a small UX win that makes their app feel polished, and it reinforces how data flows from Python to the template and back into the HTML attribute.</w:t>
+            </w:r>
+          </w:p>
+        </w:tc>
+      </w:tr>
+    </w:tbl>
+    <w:p>
+      <w:pPr>
+        <w:spacing w:after="0" w:before="200"/>
+      </w:pPr>
+    </w:p>
+    <w:p>
+      <w:pPr>
+        <w:spacing w:after="80" w:before="240"/>
+      </w:pPr>
+      <w:r>
+        <w:rPr>
+          <w:rFonts w:ascii="Arial" w:cs="Arial" w:eastAsia="Arial" w:hAnsi="Arial"/>
+          <w:sz w:val="22"/>
+          <w:szCs w:val="22"/>
+        </w:rPr>
+        <w:t xml:space="preserve">🎯  </w:t>
+      </w:r>
+      <w:r>
+        <w:rPr>
+          <w:rFonts w:ascii="Arial" w:cs="Arial" w:eastAsia="Arial" w:hAnsi="Arial"/>
+          <w:b/>
+          <w:bCs/>
+          <w:color w:val="1B3A5C"/>
+          <w:sz w:val="22"/>
+          <w:szCs w:val="22"/>
+        </w:rPr>
+        <w:t xml:space="preserve">Wrap-up</w:t>
+      </w:r>
+    </w:p>
+    <w:p>
+      <w:pPr>
+        <w:spacing w:after="40" w:before="40"/>
+      </w:pPr>
+      <w:r>
+        <w:rPr>
+          <w:rFonts w:ascii="Arial" w:cs="Arial" w:eastAsia="Arial" w:hAnsi="Arial"/>
+          <w:i/>
+          <w:iCs/>
+          <w:color w:val="666666"/>
+          <w:sz w:val="20"/>
+          <w:szCs w:val="20"/>
+        </w:rPr>
+        <w:t xml:space="preserve">[15 minutes]</w:t>
+      </w:r>
+    </w:p>
+    <w:p>
+      <w:pPr>
+        <w:pStyle w:val="ListParagraph"/>
+        <w:numPr>
+          <w:ilvl w:val="0"/>
+          <w:numId w:val="34"/>
+        </w:numPr>
+        <w:spacing w:after="40" w:before="40"/>
+      </w:pPr>
+      <w:r>
+        <w:rPr>
+          <w:rFonts w:ascii="Arial" w:cs="Arial" w:eastAsia="Arial" w:hAnsi="Arial"/>
+          <w:color w:val="333333"/>
+          <w:sz w:val="21"/>
+          <w:szCs w:val="21"/>
+        </w:rPr>
+        <w:t xml:space="preserve">2–3 students demo their quiz or search page</w:t>
+      </w:r>
+    </w:p>
+    <w:p>
+      <w:pPr>
+        <w:pStyle w:val="ListParagraph"/>
+        <w:numPr>
+          <w:ilvl w:val="0"/>
+          <w:numId w:val="34"/>
+        </w:numPr>
+        <w:spacing w:after="40" w:before="40"/>
+      </w:pPr>
+      <w:r>
+        <w:rPr>
+          <w:rFonts w:ascii="Arial" w:cs="Arial" w:eastAsia="Arial" w:hAnsi="Arial"/>
+          <w:color w:val="333333"/>
+          <w:sz w:val="21"/>
+          <w:szCs w:val="21"/>
+        </w:rPr>
+        <w:t xml:space="preserve">Reinforce: GET puts data in the URL, which means it is visible and bookmarkable — great for searches, bad for passwords</w:t>
+      </w:r>
+    </w:p>
+    <w:p>
+      <w:pPr>
+        <w:pStyle w:val="ListParagraph"/>
+        <w:numPr>
+          <w:ilvl w:val="0"/>
+          <w:numId w:val="34"/>
+        </w:numPr>
+        <w:spacing w:after="40" w:before="40"/>
+      </w:pPr>
+      <w:r>
+        <w:rPr>
+          <w:rFonts w:ascii="Arial" w:cs="Arial" w:eastAsia="Arial" w:hAnsi="Arial"/>
+          <w:color w:val="333333"/>
+          <w:sz w:val="21"/>
+          <w:szCs w:val="21"/>
+        </w:rPr>
+        <w:t xml:space="preserve">Seed next class: "GET is perfect for reading and filtering. But what about when you want to SAVE something — like a contact form, a login, a comment? You do not want that stuff in the URL. Next class: POST."</w:t>
+      </w:r>
+    </w:p>
+    <w:p>
+      <w:pPr>
+        <w:spacing w:after="0" w:before="300"/>
+      </w:pPr>
+    </w:p>
+    <w:p>
+      <w:pPr>
+        <w:spacing w:after="100" w:before="300"/>
+      </w:pPr>
+      <w:r>
+        <w:rPr>
+          <w:rFonts w:ascii="Arial" w:cs="Arial" w:eastAsia="Arial" w:hAnsi="Arial"/>
+          <w:b/>
+          <w:bCs/>
+          <w:color w:val="2E75B6"/>
+          <w:sz w:val="24"/>
+          <w:szCs w:val="24"/>
+        </w:rPr>
+        <w:t xml:space="preserve">Materials &amp; Preparation</w:t>
+      </w:r>
+    </w:p>
+    <w:p>
+      <w:pPr>
+        <w:pStyle w:val="ListParagraph"/>
+        <w:numPr>
+          <w:ilvl w:val="0"/>
+          <w:numId w:val="35"/>
+        </w:numPr>
+        <w:spacing w:after="40" w:before="40"/>
+      </w:pPr>
+      <w:r>
+        <w:rPr>
+          <w:rFonts w:ascii="Arial" w:cs="Arial" w:eastAsia="Arial" w:hAnsi="Arial"/>
+          <w:b/>
+          <w:bCs/>
+          <w:color w:val="333333"/>
+          <w:sz w:val="21"/>
+          <w:szCs w:val="21"/>
+        </w:rPr>
+        <w:t xml:space="preserve">Cheat sheet: </w:t>
+      </w:r>
+      <w:r>
+        <w:rPr>
+          <w:rFonts w:ascii="Arial" w:cs="Arial" w:eastAsia="Arial" w:hAnsi="Arial"/>
+          <w:color w:val="333333"/>
+          <w:sz w:val="21"/>
+          <w:szCs w:val="21"/>
+        </w:rPr>
+        <w:t xml:space="preserve">HTML form syntax (&lt;form&gt;, action, method, name), request.args.get() with default values, the one-route-two-states pattern</w:t>
+      </w:r>
+    </w:p>
+    <w:p>
+      <w:pPr>
+        <w:pStyle w:val="ListParagraph"/>
+        <w:numPr>
+          <w:ilvl w:val="0"/>
+          <w:numId w:val="35"/>
+        </w:numPr>
+        <w:spacing w:after="40" w:before="40"/>
+      </w:pPr>
+      <w:r>
+        <w:rPr>
+          <w:rFonts w:ascii="Arial" w:cs="Arial" w:eastAsia="Arial" w:hAnsi="Arial"/>
+          <w:b/>
+          <w:bCs/>
+          <w:color w:val="333333"/>
+          <w:sz w:val="21"/>
+          <w:szCs w:val="21"/>
+        </w:rPr>
+        <w:t xml:space="preserve">HTML form elements reference: </w:t>
+      </w:r>
+      <w:r>
+        <w:rPr>
+          <w:rFonts w:ascii="Arial" w:cs="Arial" w:eastAsia="Arial" w:hAnsi="Arial"/>
+          <w:color w:val="333333"/>
+          <w:sz w:val="21"/>
+          <w:szCs w:val="21"/>
+        </w:rPr>
+        <w:t xml:space="preserve">&lt;input type="text"&gt;, &lt;select&gt;, &lt;input type="radio"&gt; — just the syntax, since they had limited HTML time in the crash course</w:t>
+      </w:r>
+    </w:p>
+    <w:p>
+      <w:pPr>
+        <w:pStyle w:val="ListParagraph"/>
+        <w:numPr>
+          <w:ilvl w:val="0"/>
+          <w:numId w:val="35"/>
+        </w:numPr>
+        <w:spacing w:after="40" w:before="40"/>
+      </w:pPr>
+      <w:r>
+        <w:rPr>
+          <w:rFonts w:ascii="Arial" w:cs="Arial" w:eastAsia="Arial" w:hAnsi="Arial"/>
+          <w:b/>
+          <w:bCs/>
+          <w:color w:val="333333"/>
+          <w:sz w:val="21"/>
+          <w:szCs w:val="21"/>
+        </w:rPr>
+        <w:t xml:space="preserve">Troubleshooting guide: </w:t>
+      </w:r>
+      <w:r>
+        <w:rPr>
+          <w:rFonts w:ascii="Arial" w:cs="Arial" w:eastAsia="Arial" w:hAnsi="Arial"/>
+          <w:color w:val="333333"/>
+          <w:sz w:val="21"/>
+          <w:szCs w:val="21"/>
+        </w:rPr>
+        <w:t xml:space="preserve">"My form isn't sending data" → check name attribute, check action URL, check method="GET"</w:t>
+      </w:r>
+    </w:p>
+    <w:p>
+      <w:pPr>
+        <w:spacing w:after="0" w:before="300"/>
+      </w:pPr>
+    </w:p>
+    <w:p>
+      <w:pPr>
+        <w:spacing w:after="100" w:before="300"/>
+      </w:pPr>
+      <w:r>
+        <w:rPr>
+          <w:rFonts w:ascii="Arial" w:cs="Arial" w:eastAsia="Arial" w:hAnsi="Arial"/>
+          <w:b/>
+          <w:bCs/>
+          <w:color w:val="2E75B6"/>
+          <w:sz w:val="24"/>
+          <w:szCs w:val="24"/>
+        </w:rPr>
+        <w:t xml:space="preserve">Pedagogical Notes</w:t>
+      </w:r>
+    </w:p>
+    <w:p>
+      <w:pPr>
+        <w:spacing w:after="60" w:before="60"/>
+      </w:pPr>
+      <w:r>
+        <w:rPr>
+          <w:rFonts w:ascii="Arial" w:cs="Arial" w:eastAsia="Arial" w:hAnsi="Arial"/>
+          <w:color w:val="333333"/>
+          <w:sz w:val="21"/>
+          <w:szCs w:val="21"/>
+        </w:rPr>
+        <w:t xml:space="preserve">This session is the turning point where their apps stop being static displays and start responding to users. That psychological shift is huge — lean into it. The moment a student sees their own typed input reflected back on the page, they will feel the power.</w:t>
+      </w:r>
+    </w:p>
+    <w:p>
+      <w:pPr>
+        <w:spacing w:after="0" w:before="60"/>
+      </w:pPr>
+    </w:p>
+    <w:p>
+      <w:pPr>
+        <w:spacing w:after="60" w:before="60"/>
+      </w:pPr>
+      <w:r>
+        <w:rPr>
+          <w:rFonts w:ascii="Arial" w:cs="Arial" w:eastAsia="Arial" w:hAnsi="Arial"/>
+          <w:color w:val="333333"/>
+          <w:sz w:val="21"/>
+          <w:szCs w:val="21"/>
+        </w:rPr>
+        <w:t xml:space="preserve">The GET method is taught first because the data is visible in the URL, making it concrete and debuggable. Students can literally see their form data in the address bar. POST (next session) hides the data, which is harder to debug mentally — better to start with what they can see.</w:t>
+      </w:r>
+    </w:p>
+    <w:p>
+      <w:pPr>
+        <w:spacing w:after="0" w:before="60"/>
+      </w:pPr>
+    </w:p>
+    <w:p>
+      <w:pPr>
+        <w:spacing w:after="60" w:before="60"/>
+      </w:pPr>
+      <w:r>
+        <w:rPr>
+          <w:rFonts w:ascii="Arial" w:cs="Arial" w:eastAsia="Arial" w:hAnsi="Arial"/>
+          <w:color w:val="333333"/>
+          <w:sz w:val="21"/>
+          <w:szCs w:val="21"/>
+        </w:rPr>
+        <w:t xml:space="preserve">The "one route, two states" pattern (show form when empty, show results when filled) is a design pattern they will reuse throughout the course. Do not over-formalize it — just show it working and they will absorb it.</w:t>
+      </w:r>
+    </w:p>
+    <w:p>
+      <w:pPr>
+        <w:spacing w:after="0" w:before="60"/>
+      </w:pPr>
+    </w:p>
+    <w:p>
+      <w:pPr>
+        <w:spacing w:after="60" w:before="60"/>
+      </w:pPr>
+      <w:r>
+        <w:rPr>
+          <w:rFonts w:ascii="Arial" w:cs="Arial" w:eastAsia="Arial" w:hAnsi="Arial"/>
+          <w:color w:val="333333"/>
+          <w:sz w:val="21"/>
+          <w:szCs w:val="21"/>
+        </w:rPr>
+        <w:t xml:space="preserve">For the quiz project, resist the urge to make the quiz logic complex. The point is form → Flask → response, not building a quiz engine. A few if/elif blocks based on the answers is plenty.</w:t>
+      </w:r>
+    </w:p>
     <w:sectPr>
-      <w:headerReference w:type="default" r:id="rId13"/>
-      <w:footerReference w:type="default" r:id="rId14"/>
+      <w:headerReference w:type="default" r:id="rId15"/>
+      <w:footerReference w:type="default" r:id="rId16"/>
       <w:pgSz w:w="12240" w:h="15840" w:orient="portrait"/>
       <w:pgMar w:top="1440" w:right="1440" w:bottom="1440" w:left="1440" w:header="708" w:footer="708" w:gutter="0"/>
       <w:pgNumType/>
@@ -8631,6 +10995,37 @@
 </w:ftr>
 </file>
 
+<file path=word/footer5.xml><?xml version="1.0" encoding="utf-8"?>
+<w:ftr xmlns:wpc="http://schemas.microsoft.com/office/word/2010/wordprocessingCanvas" xmlns:mc="http://schemas.openxmlformats.org/markup-compatibility/2006" xmlns:o="urn:schemas-microsoft-com:office:office" xmlns:r="http://schemas.openxmlformats.org/officeDocument/2006/relationships" xmlns:m="http://schemas.openxmlformats.org/officeDocument/2006/math" xmlns:v="urn:schemas-microsoft-com:vml" xmlns:wp14="http://schemas.microsoft.com/office/word/2010/wordprocessingDrawing" xmlns:wp="http://schemas.openxmlformats.org/drawingml/2006/wordprocessingDrawing" xmlns:w10="urn:schemas-microsoft-com:office:word" xmlns:w="http://schemas.openxmlformats.org/wordprocessingml/2006/main" xmlns:w14="http://schemas.microsoft.com/office/word/2010/wordml" xmlns:w15="http://schemas.microsoft.com/office/word/2012/wordml" xmlns:wpg="http://schemas.microsoft.com/office/word/2010/wordprocessingGroup" xmlns:wpi="http://schemas.microsoft.com/office/word/2010/wordprocessingInk" xmlns:wne="http://schemas.microsoft.com/office/word/2006/wordml" xmlns:wps="http://schemas.microsoft.com/office/word/2010/wordprocessingShape">
+  <w:p>
+    <w:pPr>
+      <w:jc w:val="center"/>
+    </w:pPr>
+    <w:r>
+      <w:rPr>
+        <w:rFonts w:ascii="Arial" w:cs="Arial" w:eastAsia="Arial" w:hAnsi="Arial"/>
+        <w:color w:val="666666"/>
+        <w:sz w:val="18"/>
+        <w:szCs w:val="18"/>
+      </w:rPr>
+      <w:t xml:space="preserve">Page </w:t>
+    </w:r>
+    <w:r>
+      <w:rPr>
+        <w:rFonts w:ascii="Arial" w:cs="Arial" w:eastAsia="Arial" w:hAnsi="Arial"/>
+        <w:color w:val="666666"/>
+        <w:sz w:val="18"/>
+        <w:szCs w:val="18"/>
+      </w:rPr>
+      <w:fldChar w:fldCharType="begin"/>
+      <w:instrText xml:space="preserve">PAGE</w:instrText>
+      <w:fldChar w:fldCharType="separate"/>
+      <w:fldChar w:fldCharType="end"/>
+    </w:r>
+  </w:p>
+</w:ftr>
+</file>
+
 <file path=word/footnotes.xml><?xml version="1.0" encoding="utf-8"?>
 <w:footnotes xmlns:wpc="http://schemas.microsoft.com/office/word/2010/wordprocessingCanvas" xmlns:mc="http://schemas.openxmlformats.org/markup-compatibility/2006" xmlns:o="urn:schemas-microsoft-com:office:office" xmlns:r="http://schemas.openxmlformats.org/officeDocument/2006/relationships" xmlns:m="http://schemas.openxmlformats.org/officeDocument/2006/math" xmlns:v="urn:schemas-microsoft-com:vml" xmlns:wp14="http://schemas.microsoft.com/office/word/2010/wordprocessingDrawing" xmlns:wp="http://schemas.openxmlformats.org/drawingml/2006/wordprocessingDrawing" xmlns:w10="urn:schemas-microsoft-com:office:word" xmlns:w="http://schemas.openxmlformats.org/wordprocessingml/2006/main" xmlns:w14="http://schemas.microsoft.com/office/word/2010/wordml" xmlns:w15="http://schemas.microsoft.com/office/word/2012/wordml" xmlns:wpg="http://schemas.microsoft.com/office/word/2010/wordprocessingGroup" xmlns:wpi="http://schemas.microsoft.com/office/word/2010/wordprocessingInk" xmlns:wne="http://schemas.microsoft.com/office/word/2006/wordml" xmlns:wps="http://schemas.microsoft.com/office/word/2010/wordprocessingShape" mc:Ignorable="w14 w15 wp14">
   <w:footnote w:type="separator" w:id="-1">
@@ -8688,7 +11083,7 @@
         <w:sz w:val="18"/>
         <w:szCs w:val="18"/>
       </w:rPr>
-      <w:t xml:space="preserve">Flask Course Plan</w:t>
+      <w:t xml:space="preserve">Session : Course Overview</w:t>
     </w:r>
     <w:r>
       <w:rPr>
@@ -8699,7 +11094,7 @@
         <w:sz w:val="18"/>
         <w:szCs w:val="18"/>
       </w:rPr>
-      <w:t xml:space="preserve">	Python Web Development</w:t>
+      <w:t xml:space="preserve">	Flask Course Plan</w:t>
     </w:r>
   </w:p>
 </w:hdr>
@@ -8816,6 +11211,43 @@
 </w:hdr>
 </file>
 
+<file path=word/header5.xml><?xml version="1.0" encoding="utf-8"?>
+<w:hdr xmlns:wpc="http://schemas.microsoft.com/office/word/2010/wordprocessingCanvas" xmlns:mc="http://schemas.openxmlformats.org/markup-compatibility/2006" xmlns:o="urn:schemas-microsoft-com:office:office" xmlns:r="http://schemas.openxmlformats.org/officeDocument/2006/relationships" xmlns:m="http://schemas.openxmlformats.org/officeDocument/2006/math" xmlns:v="urn:schemas-microsoft-com:vml" xmlns:wp14="http://schemas.microsoft.com/office/word/2010/wordprocessingDrawing" xmlns:wp="http://schemas.openxmlformats.org/drawingml/2006/wordprocessingDrawing" xmlns:w10="urn:schemas-microsoft-com:office:word" xmlns:w="http://schemas.openxmlformats.org/wordprocessingml/2006/main" xmlns:w14="http://schemas.microsoft.com/office/word/2010/wordml" xmlns:w15="http://schemas.microsoft.com/office/word/2012/wordml" xmlns:wpg="http://schemas.microsoft.com/office/word/2010/wordprocessingGroup" xmlns:wpi="http://schemas.microsoft.com/office/word/2010/wordprocessingInk" xmlns:wne="http://schemas.microsoft.com/office/word/2006/wordml" xmlns:wps="http://schemas.microsoft.com/office/word/2010/wordprocessingShape" xmlns:cx="http://schemas.microsoft.com/office/drawing/2014/chartex" xmlns:cx1="http://schemas.microsoft.com/office/drawing/2015/9/8/chartex" xmlns:cx2="http://schemas.microsoft.com/office/drawing/2015/10/21/chartex" xmlns:cx3="http://schemas.microsoft.com/office/drawing/2016/5/9/chartex" xmlns:cx4="http://schemas.microsoft.com/office/drawing/2016/5/10/chartex" xmlns:cx5="http://schemas.microsoft.com/office/drawing/2016/5/11/chartex" xmlns:cx6="http://schemas.microsoft.com/office/drawing/2016/5/12/chartex" xmlns:cx7="http://schemas.microsoft.com/office/drawing/2016/5/13/chartex" xmlns:cx8="http://schemas.microsoft.com/office/drawing/2016/5/14/chartex" xmlns:w16cid="http://schemas.microsoft.com/office/word/2016/wordml/cid" xmlns:w16se="http://schemas.microsoft.com/office/word/2015/wordml/symex">
+  <w:p>
+    <w:pPr>
+      <w:pBdr>
+        <w:bottom w:val="single" w:color="E0E0E0" w:sz="4" w:space="1"/>
+      </w:pBdr>
+      <w:tabs>
+        <w:tab w:val="right" w:pos="9026"/>
+      </w:tabs>
+    </w:pPr>
+    <w:r>
+      <w:rPr>
+        <w:rFonts w:ascii="Arial" w:cs="Arial" w:eastAsia="Arial" w:hAnsi="Arial"/>
+        <w:i/>
+        <w:iCs/>
+        <w:color w:val="666666"/>
+        <w:sz w:val="18"/>
+        <w:szCs w:val="18"/>
+      </w:rPr>
+      <w:t xml:space="preserve">Session 4: Forms &amp; User Input (GET)</w:t>
+    </w:r>
+    <w:r>
+      <w:rPr>
+        <w:rFonts w:ascii="Arial" w:cs="Arial" w:eastAsia="Arial" w:hAnsi="Arial"/>
+        <w:i/>
+        <w:iCs/>
+        <w:color w:val="666666"/>
+        <w:sz w:val="18"/>
+        <w:szCs w:val="18"/>
+      </w:rPr>
+      <w:t xml:space="preserve">	Flask Course Plan</w:t>
+    </w:r>
+  </w:p>
+</w:hdr>
+</file>
+
 <file path=word/numbering.xml><?xml version="1.0" encoding="utf-8"?>
 <w:numbering xmlns:wpc="http://schemas.microsoft.com/office/word/2010/wordprocessingCanvas" xmlns:mc="http://schemas.openxmlformats.org/markup-compatibility/2006" xmlns:o="urn:schemas-microsoft-com:office:office" xmlns:r="http://schemas.openxmlformats.org/officeDocument/2006/relationships" xmlns:m="http://schemas.openxmlformats.org/officeDocument/2006/math" xmlns:v="urn:schemas-microsoft-com:vml" xmlns:wp14="http://schemas.microsoft.com/office/word/2010/wordprocessingDrawing" xmlns:wp="http://schemas.openxmlformats.org/drawingml/2006/wordprocessingDrawing" xmlns:w10="urn:schemas-microsoft-com:office:word" xmlns:w="http://schemas.openxmlformats.org/wordprocessingml/2006/main" xmlns:w14="http://schemas.microsoft.com/office/word/2010/wordml" xmlns:w15="http://schemas.microsoft.com/office/word/2012/wordml" xmlns:wpg="http://schemas.microsoft.com/office/word/2010/wordprocessingGroup" xmlns:wpi="http://schemas.microsoft.com/office/word/2010/wordprocessingInk" xmlns:wne="http://schemas.microsoft.com/office/word/2006/wordml" xmlns:wps="http://schemas.microsoft.com/office/word/2010/wordprocessingShape" mc:Ignorable="w14 w15 wp14">
   <w:abstractNum w:abstractNumId="1" w15:restartNumberingAfterBreak="0">
@@ -9509,7 +11941,7 @@
     </w:lvlOverride>
   </w:num>
   <w:num w:numId="2">
-    <w:abstractNumId w:val="11"/>
+    <w:abstractNumId w:val="2"/>
     <w:lvlOverride w:ilvl="0">
       <w:startOverride w:val="1"/>
     </w:lvlOverride>
@@ -9545,13 +11977,13 @@
     </w:lvlOverride>
   </w:num>
   <w:num w:numId="8">
-    <w:abstractNumId w:val="9"/>
+    <w:abstractNumId w:val="8"/>
     <w:lvlOverride w:ilvl="0">
       <w:startOverride w:val="1"/>
     </w:lvlOverride>
   </w:num>
   <w:num w:numId="9">
-    <w:abstractNumId w:val="8"/>
+    <w:abstractNumId w:val="9"/>
     <w:lvlOverride w:ilvl="0">
       <w:startOverride w:val="1"/>
     </w:lvlOverride>
@@ -9563,7 +11995,7 @@
     </w:lvlOverride>
   </w:num>
   <w:num w:numId="11">
-    <w:abstractNumId w:val="12"/>
+    <w:abstractNumId w:val="11"/>
     <w:lvlOverride w:ilvl="0">
       <w:startOverride w:val="1"/>
     </w:lvlOverride>
@@ -9654,6 +12086,60 @@
   </w:num>
   <w:num w:numId="26">
     <w:abstractNumId w:val="27"/>
+    <w:lvlOverride w:ilvl="0">
+      <w:startOverride w:val="1"/>
+    </w:lvlOverride>
+  </w:num>
+  <w:num w:numId="27">
+    <w:abstractNumId w:val="28"/>
+    <w:lvlOverride w:ilvl="0">
+      <w:startOverride w:val="1"/>
+    </w:lvlOverride>
+  </w:num>
+  <w:num w:numId="28">
+    <w:abstractNumId w:val="29"/>
+    <w:lvlOverride w:ilvl="0">
+      <w:startOverride w:val="1"/>
+    </w:lvlOverride>
+  </w:num>
+  <w:num w:numId="29">
+    <w:abstractNumId w:val="30"/>
+    <w:lvlOverride w:ilvl="0">
+      <w:startOverride w:val="1"/>
+    </w:lvlOverride>
+  </w:num>
+  <w:num w:numId="30">
+    <w:abstractNumId w:val="31"/>
+    <w:lvlOverride w:ilvl="0">
+      <w:startOverride w:val="1"/>
+    </w:lvlOverride>
+  </w:num>
+  <w:num w:numId="31">
+    <w:abstractNumId w:val="32"/>
+    <w:lvlOverride w:ilvl="0">
+      <w:startOverride w:val="1"/>
+    </w:lvlOverride>
+  </w:num>
+  <w:num w:numId="32">
+    <w:abstractNumId w:val="33"/>
+    <w:lvlOverride w:ilvl="0">
+      <w:startOverride w:val="1"/>
+    </w:lvlOverride>
+  </w:num>
+  <w:num w:numId="33">
+    <w:abstractNumId w:val="34"/>
+    <w:lvlOverride w:ilvl="0">
+      <w:startOverride w:val="1"/>
+    </w:lvlOverride>
+  </w:num>
+  <w:num w:numId="34">
+    <w:abstractNumId w:val="35"/>
+    <w:lvlOverride w:ilvl="0">
+      <w:startOverride w:val="1"/>
+    </w:lvlOverride>
+  </w:num>
+  <w:num w:numId="35">
+    <w:abstractNumId w:val="36"/>
     <w:lvlOverride w:ilvl="0">
       <w:startOverride w:val="1"/>
     </w:lvlOverride>
@@ -9880,23 +12366,5 @@
       <w:szCs w:val="28"/>
     </w:rPr>
   </w:style>
-  <w:style w:type="paragraph" w:styleId="Heading3">
-    <w:name w:val="Heading 3"/>
-    <w:basedOn w:val="Normal"/>
-    <w:next w:val="Normal"/>
-    <w:qFormat/>
-    <w:pPr>
-      <w:spacing w:after="120" w:before="200"/>
-      <w:outlineLvl w:val="2"/>
-    </w:pPr>
-    <w:rPr>
-      <w:rFonts w:ascii="Arial" w:cs="Arial" w:eastAsia="Arial" w:hAnsi="Arial"/>
-      <w:b/>
-      <w:bCs/>
-      <w:color w:val="333333"/>
-      <w:sz w:val="24"/>
-      <w:szCs w:val="24"/>
-    </w:rPr>
-  </w:style>
 </w:styles>
 </file>
</xml_diff>